<commit_message>
Se agregan dailys rango 07-09 / 24-09
</commit_message>
<xml_diff>
--- a/Fase 2/Evidencias Proyecto/Minuta_-_SegurIA-LPR_-_.docx
+++ b/Fase 2/Evidencias Proyecto/Minuta_-_SegurIA-LPR_-_.docx
@@ -83,6 +83,8 @@
             <w:r>
               <w:rPr>
                 <w:color w:val="auto"/>
+                <w:sz w:val="18"/>
+                <w:szCs w:val="18"/>
               </w:rPr>
               <w:t>SegurIA-LPR</w:t>
             </w:r>
@@ -135,6 +137,17 @@
                 <w:szCs w:val="18"/>
               </w:rPr>
             </w:pPr>
+            <w:r>
+              <w:rPr>
+                <w:rStyle w:val="Estilo11ptNegritaBlanco"/>
+                <w:b w:val="0"/>
+                <w:bCs w:val="0"/>
+                <w:color w:val="auto"/>
+                <w:sz w:val="18"/>
+                <w:szCs w:val="18"/>
+              </w:rPr>
+              <w:t>24-09-2025</w:t>
+            </w:r>
           </w:p>
         </w:tc>
         <w:tc>
@@ -174,9 +187,20 @@
                 <w:rStyle w:val="Estilo11ptNegritaBlanco"/>
                 <w:b w:val="0"/>
                 <w:color w:val="auto"/>
-                <w:szCs w:val="18"/>
-              </w:rPr>
-            </w:pPr>
+                <w:sz w:val="18"/>
+                <w:szCs w:val="18"/>
+              </w:rPr>
+            </w:pPr>
+            <w:r>
+              <w:rPr>
+                <w:rStyle w:val="Estilo11ptNegritaBlanco"/>
+                <w:b w:val="0"/>
+                <w:color w:val="auto"/>
+                <w:sz w:val="18"/>
+                <w:szCs w:val="18"/>
+              </w:rPr>
+              <w:t>-</w:t>
+            </w:r>
           </w:p>
         </w:tc>
       </w:tr>
@@ -222,7 +246,8 @@
                 <w:b w:val="0"/>
                 <w:bCs w:val="0"/>
                 <w:color w:val="auto"/>
-                <w:szCs w:val="20"/>
+                <w:sz w:val="18"/>
+                <w:szCs w:val="18"/>
               </w:rPr>
             </w:pPr>
             <w:r>
@@ -231,7 +256,8 @@
                 <w:b w:val="0"/>
                 <w:bCs w:val="0"/>
                 <w:color w:val="auto"/>
-                <w:szCs w:val="20"/>
+                <w:sz w:val="18"/>
+                <w:szCs w:val="18"/>
               </w:rPr>
               <w:t>Google Meet</w:t>
             </w:r>
@@ -273,6 +299,7 @@
                 <w:rStyle w:val="Estilo11ptNegritaBlanco"/>
                 <w:b w:val="0"/>
                 <w:color w:val="auto"/>
+                <w:sz w:val="18"/>
                 <w:szCs w:val="18"/>
               </w:rPr>
             </w:pPr>
@@ -281,18 +308,10 @@
                 <w:rStyle w:val="Estilo11ptNegritaBlanco"/>
                 <w:b w:val="0"/>
                 <w:color w:val="auto"/>
-                <w:szCs w:val="18"/>
-              </w:rPr>
-              <w:t>Brandon Cayuela</w:t>
-            </w:r>
-            <w:r>
-              <w:rPr>
-                <w:rStyle w:val="Estilo11ptNegritaBlanco"/>
-                <w:b w:val="0"/>
-                <w:color w:val="auto"/>
-                <w:szCs w:val="18"/>
-              </w:rPr>
-              <w:t xml:space="preserve"> – Erick Quinchavil</w:t>
+                <w:sz w:val="18"/>
+                <w:szCs w:val="18"/>
+              </w:rPr>
+              <w:t>Brandon Cayuela – Erick Quinchavil</w:t>
             </w:r>
           </w:p>
         </w:tc>
@@ -374,6 +393,7 @@
                 <w:b w:val="0"/>
                 <w:bCs w:val="0"/>
                 <w:color w:val="auto"/>
+                <w:sz w:val="18"/>
                 <w:szCs w:val="18"/>
               </w:rPr>
             </w:pPr>
@@ -383,6 +403,7 @@
                 <w:b w:val="0"/>
                 <w:bCs w:val="0"/>
                 <w:color w:val="auto"/>
+                <w:sz w:val="18"/>
                 <w:szCs w:val="18"/>
               </w:rPr>
               <w:t>Brandon Cayuela</w:t>
@@ -393,6 +414,7 @@
                 <w:b w:val="0"/>
                 <w:bCs w:val="0"/>
                 <w:color w:val="auto"/>
+                <w:sz w:val="18"/>
                 <w:szCs w:val="18"/>
               </w:rPr>
               <w:t xml:space="preserve"> – Erick Quinchavil</w:t>
@@ -449,7 +471,40 @@
                 <w:sz w:val="18"/>
                 <w:szCs w:val="18"/>
               </w:rPr>
-              <w:t>03-09-2025</w:t>
+              <w:t>24</w:t>
+            </w:r>
+            <w:r>
+              <w:rPr>
+                <w:rStyle w:val="Estilo11ptNegritaBlanco"/>
+                <w:b w:val="0"/>
+                <w:bCs w:val="0"/>
+                <w:color w:val="auto"/>
+                <w:sz w:val="18"/>
+                <w:szCs w:val="18"/>
+              </w:rPr>
+              <w:t>-0</w:t>
+            </w:r>
+            <w:r>
+              <w:rPr>
+                <w:rStyle w:val="Estilo11ptNegritaBlanco"/>
+                <w:b w:val="0"/>
+                <w:bCs w:val="0"/>
+                <w:color w:val="auto"/>
+                <w:sz w:val="18"/>
+                <w:szCs w:val="18"/>
+              </w:rPr>
+              <w:t>9</w:t>
+            </w:r>
+            <w:r>
+              <w:rPr>
+                <w:rStyle w:val="Estilo11ptNegritaBlanco"/>
+                <w:b w:val="0"/>
+                <w:bCs w:val="0"/>
+                <w:color w:val="auto"/>
+                <w:sz w:val="18"/>
+                <w:szCs w:val="18"/>
+              </w:rPr>
+              <w:t>-2025</w:t>
             </w:r>
           </w:p>
         </w:tc>
@@ -629,14 +684,16 @@
               <w:rPr>
                 <w:rStyle w:val="Estilo11pt"/>
                 <w:color w:val="auto"/>
-                <w:szCs w:val="20"/>
+                <w:sz w:val="18"/>
+                <w:szCs w:val="18"/>
               </w:rPr>
             </w:pPr>
             <w:r>
               <w:rPr>
                 <w:rStyle w:val="Estilo11pt"/>
                 <w:color w:val="auto"/>
-                <w:szCs w:val="20"/>
+                <w:sz w:val="18"/>
+                <w:szCs w:val="18"/>
               </w:rPr>
               <w:t>Brandon Cayuela</w:t>
             </w:r>
@@ -653,22 +710,18 @@
               <w:jc w:val="center"/>
               <w:rPr>
                 <w:color w:val="auto"/>
+                <w:sz w:val="18"/>
+                <w:szCs w:val="18"/>
               </w:rPr>
             </w:pPr>
             <w:r>
               <w:rPr>
                 <w:rStyle w:val="Estilo11pt"/>
                 <w:color w:val="auto"/>
-                <w:szCs w:val="20"/>
-              </w:rPr>
-              <w:t>S</w:t>
-            </w:r>
-            <w:r>
-              <w:rPr>
-                <w:rStyle w:val="Estilo11pt"/>
-                <w:color w:val="auto"/>
-              </w:rPr>
-              <w:t>i</w:t>
+                <w:sz w:val="18"/>
+                <w:szCs w:val="18"/>
+              </w:rPr>
+              <w:t>Si</w:t>
             </w:r>
           </w:p>
         </w:tc>
@@ -683,13 +736,16 @@
               <w:jc w:val="center"/>
               <w:rPr>
                 <w:color w:val="auto"/>
+                <w:sz w:val="18"/>
+                <w:szCs w:val="18"/>
               </w:rPr>
             </w:pPr>
             <w:r>
               <w:rPr>
                 <w:rStyle w:val="Estilo11pt"/>
                 <w:color w:val="auto"/>
-                <w:szCs w:val="20"/>
+                <w:sz w:val="18"/>
+                <w:szCs w:val="18"/>
               </w:rPr>
               <w:t>DUOC</w:t>
             </w:r>
@@ -705,7 +761,8 @@
               <w:rPr>
                 <w:rStyle w:val="Estilo11pt"/>
                 <w:color w:val="auto"/>
-                <w:szCs w:val="20"/>
+                <w:sz w:val="18"/>
+                <w:szCs w:val="18"/>
               </w:rPr>
             </w:pPr>
           </w:p>
@@ -726,14 +783,16 @@
               <w:rPr>
                 <w:rStyle w:val="Estilo11pt"/>
                 <w:color w:val="auto"/>
-                <w:szCs w:val="20"/>
+                <w:sz w:val="18"/>
+                <w:szCs w:val="18"/>
               </w:rPr>
             </w:pPr>
             <w:r>
               <w:rPr>
                 <w:rStyle w:val="Estilo11pt"/>
                 <w:color w:val="auto"/>
-                <w:szCs w:val="20"/>
+                <w:sz w:val="18"/>
+                <w:szCs w:val="18"/>
               </w:rPr>
               <w:t>Erick Quinchavil</w:t>
             </w:r>
@@ -750,22 +809,18 @@
               <w:jc w:val="center"/>
               <w:rPr>
                 <w:color w:val="auto"/>
+                <w:sz w:val="18"/>
+                <w:szCs w:val="18"/>
               </w:rPr>
             </w:pPr>
             <w:r>
               <w:rPr>
                 <w:rStyle w:val="Estilo11pt"/>
                 <w:color w:val="auto"/>
-                <w:szCs w:val="20"/>
-              </w:rPr>
-              <w:t>S</w:t>
-            </w:r>
-            <w:r>
-              <w:rPr>
-                <w:rStyle w:val="Estilo11pt"/>
-                <w:color w:val="auto"/>
-              </w:rPr>
-              <w:t>i</w:t>
+                <w:sz w:val="18"/>
+                <w:szCs w:val="18"/>
+              </w:rPr>
+              <w:t>Si</w:t>
             </w:r>
           </w:p>
         </w:tc>
@@ -780,6 +835,8 @@
               <w:jc w:val="center"/>
               <w:rPr>
                 <w:color w:val="auto"/>
+                <w:sz w:val="18"/>
+                <w:szCs w:val="18"/>
                 <w:lang w:val="en-US"/>
               </w:rPr>
             </w:pPr>
@@ -787,7 +844,8 @@
               <w:rPr>
                 <w:rStyle w:val="Estilo11pt"/>
                 <w:color w:val="auto"/>
-                <w:szCs w:val="20"/>
+                <w:sz w:val="18"/>
+                <w:szCs w:val="18"/>
               </w:rPr>
               <w:t>DUOC</w:t>
             </w:r>
@@ -803,7 +861,8 @@
               <w:rPr>
                 <w:rStyle w:val="Estilo11pt"/>
                 <w:color w:val="auto"/>
-                <w:szCs w:val="20"/>
+                <w:sz w:val="18"/>
+                <w:szCs w:val="18"/>
                 <w:lang w:val="en-US"/>
               </w:rPr>
             </w:pPr>
@@ -938,14 +997,16 @@
               <w:rPr>
                 <w:rStyle w:val="Estilo11pt"/>
                 <w:color w:val="auto"/>
-                <w:szCs w:val="20"/>
+                <w:sz w:val="18"/>
+                <w:szCs w:val="18"/>
               </w:rPr>
             </w:pPr>
             <w:r>
               <w:rPr>
                 <w:rStyle w:val="Estilo11pt"/>
                 <w:color w:val="auto"/>
-                <w:szCs w:val="20"/>
+                <w:sz w:val="18"/>
+                <w:szCs w:val="18"/>
               </w:rPr>
               <w:t>Todos los convocados y asistentes</w:t>
             </w:r>
@@ -962,9 +1023,21 @@
               <w:spacing w:before="60" w:after="60"/>
               <w:rPr>
                 <w:color w:val="auto"/>
-                <w:szCs w:val="20"/>
-              </w:rPr>
-            </w:pPr>
+                <w:sz w:val="18"/>
+                <w:szCs w:val="18"/>
+              </w:rPr>
+            </w:pPr>
+            <w:r>
+              <w:rPr>
+                <w:rStyle w:val="Estilo11ptNegritaBlanco"/>
+                <w:b w:val="0"/>
+                <w:bCs w:val="0"/>
+                <w:color w:val="auto"/>
+                <w:sz w:val="18"/>
+                <w:szCs w:val="18"/>
+              </w:rPr>
+              <w:t>24-09-2025</w:t>
+            </w:r>
           </w:p>
         </w:tc>
       </w:tr>
@@ -974,6 +1047,8 @@
         <w:rPr>
           <w:rStyle w:val="Estilo11pt"/>
           <w:color w:val="auto"/>
+          <w:sz w:val="18"/>
+          <w:szCs w:val="18"/>
         </w:rPr>
       </w:pPr>
     </w:p>
@@ -982,12 +1057,16 @@
         <w:rPr>
           <w:rStyle w:val="Estilo11pt"/>
           <w:color w:val="auto"/>
+          <w:sz w:val="18"/>
+          <w:szCs w:val="18"/>
         </w:rPr>
       </w:pPr>
       <w:r>
         <w:rPr>
           <w:rStyle w:val="Estilo11pt"/>
           <w:color w:val="auto"/>
+          <w:sz w:val="18"/>
+          <w:szCs w:val="18"/>
         </w:rPr>
         <w:t>* Tipos de Acción: Aprobar, Revisar, Informar, Acción Requerida, Archivar, Asistencia a reunión, Otras (especificar)</w:t>
       </w:r>
@@ -1068,41 +1147,31 @@
         <w:jc w:val="both"/>
         <w:rPr>
           <w:rFonts w:ascii="Arial" w:hAnsi="Arial"/>
-          <w:sz w:val="20"/>
-          <w:szCs w:val="24"/>
+          <w:sz w:val="18"/>
+          <w:szCs w:val="18"/>
         </w:rPr>
       </w:pPr>
       <w:r>
         <w:rPr>
           <w:rFonts w:ascii="Arial" w:hAnsi="Arial"/>
-          <w:sz w:val="20"/>
-          <w:szCs w:val="24"/>
+          <w:sz w:val="18"/>
+          <w:szCs w:val="18"/>
         </w:rPr>
         <w:t xml:space="preserve">Tema principal: </w:t>
       </w:r>
       <w:r>
         <w:rPr>
           <w:rFonts w:ascii="Arial" w:hAnsi="Arial"/>
-          <w:sz w:val="20"/>
-          <w:szCs w:val="24"/>
+          <w:sz w:val="18"/>
+          <w:szCs w:val="18"/>
         </w:rPr>
-        <w:t xml:space="preserve">Avances SPRINT </w:t>
+        <w:t>Inicio de proyecto y documentación inicial.</w:t>
       </w:r>
-      <w:proofErr w:type="spellStart"/>
       <w:r>
         <w:rPr>
           <w:rFonts w:ascii="Arial" w:hAnsi="Arial"/>
-          <w:sz w:val="20"/>
-          <w:szCs w:val="24"/>
-        </w:rPr>
-        <w:t>N°</w:t>
-      </w:r>
-      <w:proofErr w:type="spellEnd"/>
-      <w:r>
-        <w:rPr>
-          <w:rFonts w:ascii="Arial" w:hAnsi="Arial"/>
-          <w:sz w:val="20"/>
-          <w:szCs w:val="24"/>
+          <w:sz w:val="18"/>
+          <w:szCs w:val="18"/>
         </w:rPr>
         <w:t xml:space="preserve"> </w:t>
       </w:r>
@@ -1117,36 +1186,50 @@
         <w:jc w:val="both"/>
         <w:rPr>
           <w:rFonts w:ascii="Arial" w:hAnsi="Arial"/>
-          <w:sz w:val="20"/>
-          <w:szCs w:val="24"/>
+          <w:sz w:val="18"/>
+          <w:szCs w:val="18"/>
         </w:rPr>
       </w:pPr>
       <w:r>
         <w:rPr>
           <w:rFonts w:ascii="Arial" w:hAnsi="Arial"/>
-          <w:sz w:val="20"/>
-          <w:szCs w:val="24"/>
+          <w:sz w:val="18"/>
+          <w:szCs w:val="18"/>
         </w:rPr>
         <w:t xml:space="preserve">Actividades </w:t>
       </w:r>
       <w:r>
         <w:rPr>
           <w:rFonts w:ascii="Arial" w:hAnsi="Arial"/>
-          <w:sz w:val="20"/>
-          <w:szCs w:val="24"/>
+          <w:sz w:val="18"/>
+          <w:szCs w:val="18"/>
         </w:rPr>
-        <w:t xml:space="preserve">pendientes a realizar SPRINT </w:t>
+        <w:t xml:space="preserve">pendientes </w:t>
       </w:r>
-      <w:proofErr w:type="spellStart"/>
       <w:r>
         <w:rPr>
           <w:rFonts w:ascii="Arial" w:hAnsi="Arial"/>
-          <w:sz w:val="20"/>
-          <w:szCs w:val="24"/>
+          <w:sz w:val="18"/>
+          <w:szCs w:val="18"/>
         </w:rPr>
-        <w:t>N°</w:t>
+        <w:t>por</w:t>
       </w:r>
-      <w:proofErr w:type="spellEnd"/>
+      <w:r>
+        <w:rPr>
+          <w:rFonts w:ascii="Arial" w:hAnsi="Arial"/>
+          <w:sz w:val="18"/>
+          <w:szCs w:val="18"/>
+        </w:rPr>
+        <w:t xml:space="preserve"> realiza</w:t>
+      </w:r>
+      <w:r>
+        <w:rPr>
+          <w:rFonts w:ascii="Arial" w:hAnsi="Arial"/>
+          <w:sz w:val="18"/>
+          <w:szCs w:val="18"/>
+        </w:rPr>
+        <w:t>r …</w:t>
+      </w:r>
     </w:p>
     <w:p>
       <w:pPr>
@@ -1329,14 +1412,16 @@
               <w:rPr>
                 <w:rStyle w:val="Estilo11pt"/>
                 <w:color w:val="auto"/>
-                <w:szCs w:val="20"/>
+                <w:sz w:val="18"/>
+                <w:szCs w:val="18"/>
               </w:rPr>
             </w:pPr>
             <w:r>
               <w:rPr>
                 <w:rStyle w:val="Estilo11pt"/>
                 <w:color w:val="auto"/>
-                <w:szCs w:val="20"/>
+                <w:sz w:val="18"/>
+                <w:szCs w:val="18"/>
               </w:rPr>
               <w:t>001</w:t>
             </w:r>
@@ -1353,17 +1438,23 @@
               <w:spacing w:line="276" w:lineRule="auto"/>
               <w:rPr>
                 <w:color w:val="auto"/>
-              </w:rPr>
-            </w:pPr>
-            <w:r>
-              <w:rPr>
-                <w:color w:val="auto"/>
+                <w:sz w:val="18"/>
+                <w:szCs w:val="18"/>
+              </w:rPr>
+            </w:pPr>
+            <w:r>
+              <w:rPr>
+                <w:color w:val="auto"/>
+                <w:sz w:val="18"/>
+                <w:szCs w:val="18"/>
               </w:rPr>
               <w:t>Minuta_-_</w:t>
             </w:r>
             <w:r>
               <w:rPr>
                 <w:color w:val="auto"/>
+                <w:sz w:val="18"/>
+                <w:szCs w:val="18"/>
               </w:rPr>
               <w:t>SegurIA-LPR_-_</w:t>
             </w:r>
@@ -1379,13 +1470,15 @@
             <w:pPr>
               <w:rPr>
                 <w:color w:val="auto"/>
-                <w:szCs w:val="20"/>
-              </w:rPr>
-            </w:pPr>
-            <w:r>
-              <w:rPr>
-                <w:color w:val="auto"/>
-                <w:szCs w:val="20"/>
+                <w:sz w:val="18"/>
+                <w:szCs w:val="18"/>
+              </w:rPr>
+            </w:pPr>
+            <w:r>
+              <w:rPr>
+                <w:color w:val="auto"/>
+                <w:sz w:val="18"/>
+                <w:szCs w:val="18"/>
               </w:rPr>
               <w:t>1.0</w:t>
             </w:r>
@@ -1407,14 +1500,16 @@
               <w:rPr>
                 <w:rStyle w:val="Estilo11pt"/>
                 <w:color w:val="auto"/>
-                <w:szCs w:val="20"/>
+                <w:sz w:val="18"/>
+                <w:szCs w:val="18"/>
               </w:rPr>
             </w:pPr>
             <w:r>
               <w:rPr>
                 <w:rStyle w:val="Estilo11pt"/>
                 <w:color w:val="auto"/>
-                <w:szCs w:val="20"/>
+                <w:sz w:val="18"/>
+                <w:szCs w:val="18"/>
               </w:rPr>
               <w:t>001</w:t>
             </w:r>
@@ -1431,13 +1526,25 @@
               <w:spacing w:line="276" w:lineRule="auto"/>
               <w:rPr>
                 <w:color w:val="auto"/>
-              </w:rPr>
-            </w:pPr>
-            <w:r>
-              <w:rPr>
-                <w:color w:val="auto"/>
-              </w:rPr>
-              <w:t>1.5_GuiaEstudiante_Fase 1_Definicion Proyecto APT (Español)</w:t>
+                <w:sz w:val="18"/>
+                <w:szCs w:val="18"/>
+              </w:rPr>
+            </w:pPr>
+            <w:r>
+              <w:rPr>
+                <w:color w:val="auto"/>
+                <w:sz w:val="18"/>
+                <w:szCs w:val="18"/>
+              </w:rPr>
+              <w:t>Apellido_Nombre</w:t>
+            </w:r>
+            <w:r>
+              <w:rPr>
+                <w:color w:val="auto"/>
+                <w:sz w:val="18"/>
+                <w:szCs w:val="18"/>
+              </w:rPr>
+              <w:t>_1.1_APT122_AutoevaluacionCompetenciasFase1</w:t>
             </w:r>
           </w:p>
         </w:tc>
@@ -1451,13 +1558,431 @@
             <w:pPr>
               <w:rPr>
                 <w:color w:val="auto"/>
-                <w:szCs w:val="20"/>
-              </w:rPr>
-            </w:pPr>
-            <w:r>
-              <w:rPr>
-                <w:color w:val="auto"/>
-                <w:szCs w:val="20"/>
+                <w:sz w:val="18"/>
+                <w:szCs w:val="18"/>
+              </w:rPr>
+            </w:pPr>
+            <w:r>
+              <w:rPr>
+                <w:color w:val="auto"/>
+                <w:sz w:val="18"/>
+                <w:szCs w:val="18"/>
+              </w:rPr>
+              <w:t>1.0</w:t>
+            </w:r>
+          </w:p>
+        </w:tc>
+      </w:tr>
+      <w:tr>
+        <w:trPr>
+          <w:trHeight w:val="383"/>
+        </w:trPr>
+        <w:tc>
+          <w:tcPr>
+            <w:tcW w:w="1701" w:type="dxa"/>
+            <w:shd w:val="clear" w:color="auto" w:fill="FFFFFF" w:themeFill="background1"/>
+            <w:vAlign w:val="center"/>
+          </w:tcPr>
+          <w:p>
+            <w:pPr>
+              <w:rPr>
+                <w:rStyle w:val="Estilo11pt"/>
+                <w:color w:val="auto"/>
+                <w:sz w:val="18"/>
+                <w:szCs w:val="18"/>
+              </w:rPr>
+            </w:pPr>
+            <w:r>
+              <w:rPr>
+                <w:rStyle w:val="Estilo11pt"/>
+                <w:color w:val="auto"/>
+                <w:sz w:val="18"/>
+                <w:szCs w:val="18"/>
+              </w:rPr>
+              <w:t>001</w:t>
+            </w:r>
+          </w:p>
+        </w:tc>
+        <w:tc>
+          <w:tcPr>
+            <w:tcW w:w="5812" w:type="dxa"/>
+            <w:shd w:val="clear" w:color="auto" w:fill="FFFFFF" w:themeFill="background1"/>
+            <w:vAlign w:val="center"/>
+          </w:tcPr>
+          <w:p>
+            <w:pPr>
+              <w:spacing w:line="276" w:lineRule="auto"/>
+              <w:rPr>
+                <w:color w:val="auto"/>
+                <w:sz w:val="18"/>
+                <w:szCs w:val="18"/>
+              </w:rPr>
+            </w:pPr>
+            <w:r>
+              <w:rPr>
+                <w:color w:val="auto"/>
+                <w:sz w:val="18"/>
+                <w:szCs w:val="18"/>
+              </w:rPr>
+              <w:t>Apellido_Nombre</w:t>
+            </w:r>
+            <w:r>
+              <w:rPr>
+                <w:color w:val="auto"/>
+                <w:sz w:val="18"/>
+                <w:szCs w:val="18"/>
+              </w:rPr>
+              <w:t>_1.2_APT122_DiarioReflexionFase1</w:t>
+            </w:r>
+          </w:p>
+        </w:tc>
+        <w:tc>
+          <w:tcPr>
+            <w:tcW w:w="1985" w:type="dxa"/>
+            <w:shd w:val="clear" w:color="auto" w:fill="FFFFFF" w:themeFill="background1"/>
+            <w:vAlign w:val="center"/>
+          </w:tcPr>
+          <w:p>
+            <w:pPr>
+              <w:rPr>
+                <w:color w:val="auto"/>
+                <w:sz w:val="18"/>
+                <w:szCs w:val="18"/>
+              </w:rPr>
+            </w:pPr>
+            <w:r>
+              <w:rPr>
+                <w:color w:val="auto"/>
+                <w:sz w:val="18"/>
+                <w:szCs w:val="18"/>
+              </w:rPr>
+              <w:t>1.0</w:t>
+            </w:r>
+          </w:p>
+        </w:tc>
+      </w:tr>
+      <w:tr>
+        <w:trPr>
+          <w:trHeight w:val="383"/>
+        </w:trPr>
+        <w:tc>
+          <w:tcPr>
+            <w:tcW w:w="1701" w:type="dxa"/>
+            <w:shd w:val="clear" w:color="auto" w:fill="FFFFFF" w:themeFill="background1"/>
+            <w:vAlign w:val="center"/>
+          </w:tcPr>
+          <w:p>
+            <w:pPr>
+              <w:rPr>
+                <w:rStyle w:val="Estilo11pt"/>
+                <w:color w:val="auto"/>
+                <w:sz w:val="18"/>
+                <w:szCs w:val="18"/>
+              </w:rPr>
+            </w:pPr>
+            <w:r>
+              <w:rPr>
+                <w:rStyle w:val="Estilo11pt"/>
+                <w:color w:val="auto"/>
+                <w:sz w:val="18"/>
+                <w:szCs w:val="18"/>
+              </w:rPr>
+              <w:t>001</w:t>
+            </w:r>
+          </w:p>
+        </w:tc>
+        <w:tc>
+          <w:tcPr>
+            <w:tcW w:w="5812" w:type="dxa"/>
+            <w:shd w:val="clear" w:color="auto" w:fill="FFFFFF" w:themeFill="background1"/>
+            <w:vAlign w:val="center"/>
+          </w:tcPr>
+          <w:p>
+            <w:pPr>
+              <w:spacing w:line="276" w:lineRule="auto"/>
+              <w:rPr>
+                <w:color w:val="auto"/>
+                <w:sz w:val="18"/>
+                <w:szCs w:val="18"/>
+              </w:rPr>
+            </w:pPr>
+            <w:r>
+              <w:rPr>
+                <w:color w:val="auto"/>
+                <w:sz w:val="18"/>
+                <w:szCs w:val="18"/>
+              </w:rPr>
+              <w:t>Apellido_Nombre</w:t>
+            </w:r>
+            <w:r>
+              <w:rPr>
+                <w:color w:val="auto"/>
+                <w:sz w:val="18"/>
+                <w:szCs w:val="18"/>
+              </w:rPr>
+              <w:t>_1.3_APT122_AutoevaluacionFase1</w:t>
+            </w:r>
+          </w:p>
+        </w:tc>
+        <w:tc>
+          <w:tcPr>
+            <w:tcW w:w="1985" w:type="dxa"/>
+            <w:shd w:val="clear" w:color="auto" w:fill="FFFFFF" w:themeFill="background1"/>
+            <w:vAlign w:val="center"/>
+          </w:tcPr>
+          <w:p>
+            <w:pPr>
+              <w:rPr>
+                <w:color w:val="auto"/>
+                <w:sz w:val="18"/>
+                <w:szCs w:val="18"/>
+              </w:rPr>
+            </w:pPr>
+            <w:r>
+              <w:rPr>
+                <w:color w:val="auto"/>
+                <w:sz w:val="18"/>
+                <w:szCs w:val="18"/>
+              </w:rPr>
+              <w:t>1.0</w:t>
+            </w:r>
+          </w:p>
+        </w:tc>
+      </w:tr>
+      <w:tr>
+        <w:trPr>
+          <w:trHeight w:val="383"/>
+        </w:trPr>
+        <w:tc>
+          <w:tcPr>
+            <w:tcW w:w="1701" w:type="dxa"/>
+            <w:shd w:val="clear" w:color="auto" w:fill="FFFFFF" w:themeFill="background1"/>
+            <w:vAlign w:val="center"/>
+          </w:tcPr>
+          <w:p>
+            <w:pPr>
+              <w:rPr>
+                <w:rStyle w:val="Estilo11pt"/>
+                <w:color w:val="auto"/>
+                <w:sz w:val="18"/>
+                <w:szCs w:val="18"/>
+              </w:rPr>
+            </w:pPr>
+            <w:r>
+              <w:rPr>
+                <w:rStyle w:val="Estilo11pt"/>
+                <w:color w:val="auto"/>
+                <w:sz w:val="18"/>
+                <w:szCs w:val="18"/>
+              </w:rPr>
+              <w:t>001</w:t>
+            </w:r>
+          </w:p>
+        </w:tc>
+        <w:tc>
+          <w:tcPr>
+            <w:tcW w:w="5812" w:type="dxa"/>
+            <w:shd w:val="clear" w:color="auto" w:fill="FFFFFF" w:themeFill="background1"/>
+            <w:vAlign w:val="center"/>
+          </w:tcPr>
+          <w:p>
+            <w:pPr>
+              <w:spacing w:line="276" w:lineRule="auto"/>
+              <w:rPr>
+                <w:color w:val="auto"/>
+                <w:sz w:val="18"/>
+                <w:szCs w:val="18"/>
+              </w:rPr>
+            </w:pPr>
+            <w:r>
+              <w:rPr>
+                <w:color w:val="auto"/>
+                <w:sz w:val="18"/>
+                <w:szCs w:val="18"/>
+              </w:rPr>
+              <w:t>1.4_APT122_FormativaFase1</w:t>
+            </w:r>
+          </w:p>
+        </w:tc>
+        <w:tc>
+          <w:tcPr>
+            <w:tcW w:w="1985" w:type="dxa"/>
+            <w:shd w:val="clear" w:color="auto" w:fill="FFFFFF" w:themeFill="background1"/>
+            <w:vAlign w:val="center"/>
+          </w:tcPr>
+          <w:p>
+            <w:pPr>
+              <w:rPr>
+                <w:color w:val="auto"/>
+                <w:sz w:val="18"/>
+                <w:szCs w:val="18"/>
+              </w:rPr>
+            </w:pPr>
+            <w:r>
+              <w:rPr>
+                <w:color w:val="auto"/>
+                <w:sz w:val="18"/>
+                <w:szCs w:val="18"/>
+              </w:rPr>
+              <w:t>1.0</w:t>
+            </w:r>
+          </w:p>
+        </w:tc>
+      </w:tr>
+      <w:tr>
+        <w:trPr>
+          <w:trHeight w:val="383"/>
+        </w:trPr>
+        <w:tc>
+          <w:tcPr>
+            <w:tcW w:w="1701" w:type="dxa"/>
+            <w:shd w:val="clear" w:color="auto" w:fill="FFFFFF" w:themeFill="background1"/>
+            <w:vAlign w:val="center"/>
+          </w:tcPr>
+          <w:p>
+            <w:pPr>
+              <w:rPr>
+                <w:rStyle w:val="Estilo11pt"/>
+                <w:color w:val="auto"/>
+                <w:sz w:val="18"/>
+                <w:szCs w:val="18"/>
+              </w:rPr>
+            </w:pPr>
+            <w:r>
+              <w:rPr>
+                <w:rStyle w:val="Estilo11pt"/>
+                <w:color w:val="auto"/>
+                <w:sz w:val="18"/>
+                <w:szCs w:val="18"/>
+              </w:rPr>
+              <w:t>001</w:t>
+            </w:r>
+          </w:p>
+        </w:tc>
+        <w:tc>
+          <w:tcPr>
+            <w:tcW w:w="5812" w:type="dxa"/>
+            <w:shd w:val="clear" w:color="auto" w:fill="FFFFFF" w:themeFill="background1"/>
+            <w:vAlign w:val="center"/>
+          </w:tcPr>
+          <w:p>
+            <w:pPr>
+              <w:spacing w:line="276" w:lineRule="auto"/>
+              <w:rPr>
+                <w:color w:val="auto"/>
+                <w:sz w:val="18"/>
+                <w:szCs w:val="18"/>
+              </w:rPr>
+            </w:pPr>
+            <w:r>
+              <w:rPr>
+                <w:color w:val="auto"/>
+                <w:sz w:val="18"/>
+                <w:szCs w:val="18"/>
+              </w:rPr>
+              <w:t>1.5_GuiaEstudiante_Fase 1_Definicion Proyecto APT (Español)</w:t>
+            </w:r>
+          </w:p>
+        </w:tc>
+        <w:tc>
+          <w:tcPr>
+            <w:tcW w:w="1985" w:type="dxa"/>
+            <w:shd w:val="clear" w:color="auto" w:fill="FFFFFF" w:themeFill="background1"/>
+            <w:vAlign w:val="center"/>
+          </w:tcPr>
+          <w:p>
+            <w:pPr>
+              <w:rPr>
+                <w:color w:val="auto"/>
+                <w:sz w:val="18"/>
+                <w:szCs w:val="18"/>
+              </w:rPr>
+            </w:pPr>
+            <w:r>
+              <w:rPr>
+                <w:color w:val="auto"/>
+                <w:sz w:val="18"/>
+                <w:szCs w:val="18"/>
+              </w:rPr>
+              <w:t>1.0</w:t>
+            </w:r>
+          </w:p>
+        </w:tc>
+      </w:tr>
+      <w:tr>
+        <w:trPr>
+          <w:trHeight w:val="383"/>
+        </w:trPr>
+        <w:tc>
+          <w:tcPr>
+            <w:tcW w:w="1701" w:type="dxa"/>
+            <w:shd w:val="clear" w:color="auto" w:fill="FFFFFF" w:themeFill="background1"/>
+            <w:vAlign w:val="center"/>
+          </w:tcPr>
+          <w:p>
+            <w:pPr>
+              <w:rPr>
+                <w:rStyle w:val="Estilo11pt"/>
+                <w:color w:val="auto"/>
+                <w:sz w:val="18"/>
+                <w:szCs w:val="18"/>
+              </w:rPr>
+            </w:pPr>
+            <w:r>
+              <w:rPr>
+                <w:rStyle w:val="Estilo11pt"/>
+                <w:color w:val="auto"/>
+                <w:sz w:val="18"/>
+                <w:szCs w:val="18"/>
+              </w:rPr>
+              <w:t>001</w:t>
+            </w:r>
+          </w:p>
+        </w:tc>
+        <w:tc>
+          <w:tcPr>
+            <w:tcW w:w="5812" w:type="dxa"/>
+            <w:shd w:val="clear" w:color="auto" w:fill="FFFFFF" w:themeFill="background1"/>
+            <w:vAlign w:val="center"/>
+          </w:tcPr>
+          <w:p>
+            <w:pPr>
+              <w:spacing w:line="276" w:lineRule="auto"/>
+              <w:rPr>
+                <w:color w:val="auto"/>
+                <w:sz w:val="18"/>
+                <w:szCs w:val="18"/>
+              </w:rPr>
+            </w:pPr>
+            <w:r>
+              <w:rPr>
+                <w:color w:val="auto"/>
+                <w:sz w:val="18"/>
+                <w:szCs w:val="18"/>
+              </w:rPr>
+              <w:t>https://github.com/ErickDan12/SegurIA-LPR.git</w:t>
+            </w:r>
+          </w:p>
+        </w:tc>
+        <w:tc>
+          <w:tcPr>
+            <w:tcW w:w="1985" w:type="dxa"/>
+            <w:shd w:val="clear" w:color="auto" w:fill="FFFFFF" w:themeFill="background1"/>
+            <w:vAlign w:val="center"/>
+          </w:tcPr>
+          <w:p>
+            <w:pPr>
+              <w:rPr>
+                <w:color w:val="auto"/>
+                <w:sz w:val="18"/>
+                <w:szCs w:val="18"/>
+              </w:rPr>
+            </w:pPr>
+            <w:r>
+              <w:rPr>
+                <w:color w:val="auto"/>
+                <w:sz w:val="18"/>
+                <w:szCs w:val="18"/>
               </w:rPr>
               <w:t>1.0</w:t>
             </w:r>
@@ -1555,15 +2080,17 @@
                 <w:numId w:val="30"/>
               </w:numPr>
               <w:jc w:val="both"/>
-            </w:pPr>
-            <w:r>
-              <w:t>Se revisa la información asociada al documento “</w:t>
-            </w:r>
-            <w:r>
-              <w:t>1.5_GuiaEstudiante_Fase 1_Definicion Proyecto APT (Español)</w:t>
-            </w:r>
-            <w:r>
-              <w:t>”.</w:t>
+              <w:rPr>
+                <w:sz w:val="18"/>
+                <w:szCs w:val="18"/>
+              </w:rPr>
+            </w:pPr>
+            <w:r>
+              <w:rPr>
+                <w:sz w:val="18"/>
+                <w:szCs w:val="18"/>
+              </w:rPr>
+              <w:t>Se revisa la información asociada al documento “1.5_GuiaEstudiante_Fase 1_Definicion Proyecto APT (Español)”.</w:t>
             </w:r>
           </w:p>
           <w:p>
@@ -1574,8 +2101,16 @@
                 <w:numId w:val="30"/>
               </w:numPr>
               <w:jc w:val="both"/>
-            </w:pPr>
-            <w:r>
+              <w:rPr>
+                <w:sz w:val="18"/>
+                <w:szCs w:val="18"/>
+              </w:rPr>
+            </w:pPr>
+            <w:r>
+              <w:rPr>
+                <w:sz w:val="18"/>
+                <w:szCs w:val="18"/>
+              </w:rPr>
               <w:t>Se detallan las actividades realizadas a la fecha.</w:t>
             </w:r>
           </w:p>
@@ -1587,8 +2122,16 @@
                 <w:numId w:val="30"/>
               </w:numPr>
               <w:jc w:val="both"/>
-            </w:pPr>
-            <w:r>
+              <w:rPr>
+                <w:sz w:val="18"/>
+                <w:szCs w:val="18"/>
+              </w:rPr>
+            </w:pPr>
+            <w:r>
+              <w:rPr>
+                <w:sz w:val="18"/>
+                <w:szCs w:val="18"/>
+              </w:rPr>
               <w:t>Se informan las actividades posteriores a realizar según el avance del equipo de trabajo.</w:t>
             </w:r>
           </w:p>
@@ -1600,16 +2143,32 @@
                 <w:numId w:val="30"/>
               </w:numPr>
               <w:jc w:val="both"/>
-            </w:pPr>
-            <w:r>
+              <w:rPr>
+                <w:sz w:val="18"/>
+                <w:szCs w:val="18"/>
+              </w:rPr>
+            </w:pPr>
+            <w:r>
+              <w:rPr>
+                <w:sz w:val="18"/>
+                <w:szCs w:val="18"/>
+              </w:rPr>
               <w:t>Se solicita adjuntar comentarios a los avances respectivos (</w:t>
             </w:r>
             <w:proofErr w:type="spellStart"/>
             <w:r>
+              <w:rPr>
+                <w:sz w:val="18"/>
+                <w:szCs w:val="18"/>
+              </w:rPr>
               <w:t>commits</w:t>
             </w:r>
             <w:proofErr w:type="spellEnd"/>
             <w:r>
+              <w:rPr>
+                <w:sz w:val="18"/>
+                <w:szCs w:val="18"/>
+              </w:rPr>
               <w:t xml:space="preserve"> en el repositorio del proyecto).</w:t>
             </w:r>
           </w:p>
@@ -1661,6 +2220,7 @@
               <w:rPr>
                 <w:rFonts w:ascii="Arial" w:hAnsi="Arial" w:cs="Arial"/>
                 <w:color w:val="auto"/>
+                <w:sz w:val="18"/>
                 <w:szCs w:val="18"/>
                 <w:lang w:val="es-ES"/>
               </w:rPr>
@@ -1669,6 +2229,7 @@
               <w:rPr>
                 <w:rFonts w:ascii="Arial" w:hAnsi="Arial" w:cs="Arial"/>
                 <w:color w:val="auto"/>
+                <w:sz w:val="18"/>
                 <w:szCs w:val="18"/>
                 <w:lang w:val="es-ES"/>
               </w:rPr>
@@ -1678,6 +2239,7 @@
               <w:rPr>
                 <w:rFonts w:ascii="Arial" w:hAnsi="Arial" w:cs="Arial"/>
                 <w:color w:val="auto"/>
+                <w:sz w:val="18"/>
                 <w:szCs w:val="18"/>
                 <w:lang w:val="es-ES"/>
               </w:rPr>
@@ -2125,15 +2687,16 @@
         <w:tblLook w:val="04A0" w:firstRow="1" w:lastRow="0" w:firstColumn="1" w:lastColumn="0" w:noHBand="0" w:noVBand="1"/>
       </w:tblPr>
       <w:tblGrid>
-        <w:gridCol w:w="2268"/>
-        <w:gridCol w:w="1340"/>
-        <w:gridCol w:w="4818"/>
-        <w:gridCol w:w="783"/>
+        <w:gridCol w:w="1446"/>
+        <w:gridCol w:w="1250"/>
+        <w:gridCol w:w="4406"/>
+        <w:gridCol w:w="1257"/>
+        <w:gridCol w:w="850"/>
       </w:tblGrid>
       <w:tr>
         <w:tc>
           <w:tcPr>
-            <w:tcW w:w="2333" w:type="dxa"/>
+            <w:tcW w:w="1446" w:type="dxa"/>
             <w:shd w:val="clear" w:color="auto" w:fill="D4DEE2" w:themeFill="accent3" w:themeFillTint="99"/>
           </w:tcPr>
           <w:p>
@@ -2159,7 +2722,7 @@
         </w:tc>
         <w:tc>
           <w:tcPr>
-            <w:tcW w:w="1348" w:type="dxa"/>
+            <w:tcW w:w="1250" w:type="dxa"/>
             <w:shd w:val="clear" w:color="auto" w:fill="D4DEE2" w:themeFill="accent3" w:themeFillTint="99"/>
           </w:tcPr>
           <w:p>
@@ -2184,7 +2747,7 @@
         </w:tc>
         <w:tc>
           <w:tcPr>
-            <w:tcW w:w="4851" w:type="dxa"/>
+            <w:tcW w:w="4406" w:type="dxa"/>
             <w:shd w:val="clear" w:color="auto" w:fill="D4DEE2" w:themeFill="accent3" w:themeFillTint="99"/>
           </w:tcPr>
           <w:p>
@@ -2209,7 +2772,32 @@
         </w:tc>
         <w:tc>
           <w:tcPr>
-            <w:tcW w:w="677" w:type="dxa"/>
+            <w:tcW w:w="1257" w:type="dxa"/>
+            <w:shd w:val="clear" w:color="auto" w:fill="D4DEE2" w:themeFill="accent3" w:themeFillTint="99"/>
+          </w:tcPr>
+          <w:p>
+            <w:pPr>
+              <w:rPr>
+                <w:b/>
+                <w:color w:val="auto"/>
+                <w:szCs w:val="20"/>
+                <w:lang w:val="es-CL"/>
+              </w:rPr>
+            </w:pPr>
+            <w:r>
+              <w:rPr>
+                <w:b/>
+                <w:color w:val="auto"/>
+                <w:szCs w:val="20"/>
+                <w:lang w:val="es-CL"/>
+              </w:rPr>
+              <w:t>Estado</w:t>
+            </w:r>
+          </w:p>
+        </w:tc>
+        <w:tc>
+          <w:tcPr>
+            <w:tcW w:w="850" w:type="dxa"/>
             <w:shd w:val="clear" w:color="auto" w:fill="D4DEE2" w:themeFill="accent3" w:themeFillTint="99"/>
           </w:tcPr>
           <w:p>
@@ -2236,22 +2824,24 @@
       <w:tr>
         <w:tc>
           <w:tcPr>
-            <w:tcW w:w="2333" w:type="dxa"/>
-          </w:tcPr>
-          <w:p>
-            <w:pPr>
-              <w:rPr>
-                <w:bCs/>
-                <w:color w:val="auto"/>
-                <w:sz w:val="24"/>
-                <w:lang w:val="es-CL"/>
-              </w:rPr>
-            </w:pPr>
-            <w:r>
-              <w:rPr>
-                <w:bCs/>
-                <w:color w:val="auto"/>
-                <w:sz w:val="24"/>
+            <w:tcW w:w="1446" w:type="dxa"/>
+          </w:tcPr>
+          <w:p>
+            <w:pPr>
+              <w:rPr>
+                <w:bCs/>
+                <w:color w:val="auto"/>
+                <w:sz w:val="18"/>
+                <w:szCs w:val="18"/>
+                <w:lang w:val="es-CL"/>
+              </w:rPr>
+            </w:pPr>
+            <w:r>
+              <w:rPr>
+                <w:bCs/>
+                <w:color w:val="auto"/>
+                <w:sz w:val="18"/>
+                <w:szCs w:val="18"/>
                 <w:lang w:val="es-CL"/>
               </w:rPr>
               <w:t>Desarrollar documento 1.1 (cada integrante)</w:t>
@@ -2260,22 +2850,24 @@
         </w:tc>
         <w:tc>
           <w:tcPr>
-            <w:tcW w:w="1348" w:type="dxa"/>
-          </w:tcPr>
-          <w:p>
-            <w:pPr>
-              <w:rPr>
-                <w:bCs/>
-                <w:color w:val="auto"/>
-                <w:sz w:val="24"/>
-                <w:lang w:val="es-CL"/>
-              </w:rPr>
-            </w:pPr>
-            <w:r>
-              <w:rPr>
-                <w:bCs/>
-                <w:color w:val="auto"/>
-                <w:sz w:val="24"/>
+            <w:tcW w:w="1250" w:type="dxa"/>
+          </w:tcPr>
+          <w:p>
+            <w:pPr>
+              <w:rPr>
+                <w:bCs/>
+                <w:color w:val="auto"/>
+                <w:sz w:val="18"/>
+                <w:szCs w:val="18"/>
+                <w:lang w:val="es-CL"/>
+              </w:rPr>
+            </w:pPr>
+            <w:r>
+              <w:rPr>
+                <w:bCs/>
+                <w:color w:val="auto"/>
+                <w:sz w:val="18"/>
+                <w:szCs w:val="18"/>
                 <w:lang w:val="es-CL"/>
               </w:rPr>
               <w:t>Brandon – Erick</w:t>
@@ -2284,22 +2876,24 @@
         </w:tc>
         <w:tc>
           <w:tcPr>
-            <w:tcW w:w="4851" w:type="dxa"/>
-          </w:tcPr>
-          <w:p>
-            <w:pPr>
-              <w:rPr>
-                <w:bCs/>
-                <w:color w:val="auto"/>
-                <w:sz w:val="24"/>
-                <w:lang w:val="es-CL"/>
-              </w:rPr>
-            </w:pPr>
-            <w:r>
-              <w:rPr>
-                <w:bCs/>
-                <w:color w:val="auto"/>
-                <w:sz w:val="24"/>
+            <w:tcW w:w="4406" w:type="dxa"/>
+          </w:tcPr>
+          <w:p>
+            <w:pPr>
+              <w:rPr>
+                <w:bCs/>
+                <w:color w:val="auto"/>
+                <w:sz w:val="18"/>
+                <w:szCs w:val="18"/>
+                <w:lang w:val="es-CL"/>
+              </w:rPr>
+            </w:pPr>
+            <w:r>
+              <w:rPr>
+                <w:bCs/>
+                <w:color w:val="auto"/>
+                <w:sz w:val="18"/>
+                <w:szCs w:val="18"/>
                 <w:lang w:val="es-CL"/>
               </w:rPr>
               <w:t>Apellido_Nombre_1.1_APT122_</w:t>
@@ -2308,7 +2902,8 @@
               <w:rPr>
                 <w:bCs/>
                 <w:color w:val="auto"/>
-                <w:sz w:val="24"/>
+                <w:sz w:val="18"/>
+                <w:szCs w:val="18"/>
                 <w:lang w:val="es-CL"/>
               </w:rPr>
               <w:br/>
@@ -2318,22 +2913,50 @@
         </w:tc>
         <w:tc>
           <w:tcPr>
-            <w:tcW w:w="677" w:type="dxa"/>
-          </w:tcPr>
-          <w:p>
-            <w:pPr>
-              <w:rPr>
-                <w:bCs/>
-                <w:color w:val="auto"/>
-                <w:sz w:val="24"/>
-                <w:lang w:val="es-CL"/>
-              </w:rPr>
-            </w:pPr>
-            <w:r>
-              <w:rPr>
-                <w:bCs/>
-                <w:color w:val="auto"/>
-                <w:sz w:val="24"/>
+            <w:tcW w:w="1257" w:type="dxa"/>
+          </w:tcPr>
+          <w:p>
+            <w:pPr>
+              <w:rPr>
+                <w:bCs/>
+                <w:color w:val="auto"/>
+                <w:sz w:val="18"/>
+                <w:szCs w:val="18"/>
+                <w:lang w:val="es-CL"/>
+              </w:rPr>
+            </w:pPr>
+            <w:r>
+              <w:rPr>
+                <w:bCs/>
+                <w:color w:val="auto"/>
+                <w:sz w:val="18"/>
+                <w:szCs w:val="18"/>
+                <w:lang w:val="es-CL"/>
+              </w:rPr>
+              <w:t>Terminado</w:t>
+            </w:r>
+          </w:p>
+        </w:tc>
+        <w:tc>
+          <w:tcPr>
+            <w:tcW w:w="850" w:type="dxa"/>
+          </w:tcPr>
+          <w:p>
+            <w:pPr>
+              <w:rPr>
+                <w:bCs/>
+                <w:color w:val="auto"/>
+                <w:sz w:val="18"/>
+                <w:szCs w:val="18"/>
+                <w:lang w:val="es-CL"/>
+              </w:rPr>
+            </w:pPr>
+            <w:r>
+              <w:rPr>
+                <w:bCs/>
+                <w:color w:val="auto"/>
+                <w:sz w:val="18"/>
+                <w:szCs w:val="18"/>
                 <w:lang w:val="es-CL"/>
               </w:rPr>
               <w:t>2</w:t>
@@ -2344,22 +2967,24 @@
       <w:tr>
         <w:tc>
           <w:tcPr>
-            <w:tcW w:w="2333" w:type="dxa"/>
-          </w:tcPr>
-          <w:p>
-            <w:pPr>
-              <w:rPr>
-                <w:bCs/>
-                <w:color w:val="auto"/>
-                <w:sz w:val="24"/>
-                <w:lang w:val="es-CL"/>
-              </w:rPr>
-            </w:pPr>
-            <w:r>
-              <w:rPr>
-                <w:bCs/>
-                <w:color w:val="auto"/>
-                <w:sz w:val="24"/>
+            <w:tcW w:w="1446" w:type="dxa"/>
+          </w:tcPr>
+          <w:p>
+            <w:pPr>
+              <w:rPr>
+                <w:bCs/>
+                <w:color w:val="auto"/>
+                <w:sz w:val="18"/>
+                <w:szCs w:val="18"/>
+                <w:lang w:val="es-CL"/>
+              </w:rPr>
+            </w:pPr>
+            <w:r>
+              <w:rPr>
+                <w:bCs/>
+                <w:color w:val="auto"/>
+                <w:sz w:val="18"/>
+                <w:szCs w:val="18"/>
                 <w:lang w:val="es-CL"/>
               </w:rPr>
               <w:t>Desarrollar documento 1.2 (cada integrante)</w:t>
@@ -2368,22 +2993,24 @@
         </w:tc>
         <w:tc>
           <w:tcPr>
-            <w:tcW w:w="1348" w:type="dxa"/>
-          </w:tcPr>
-          <w:p>
-            <w:pPr>
-              <w:rPr>
-                <w:bCs/>
-                <w:color w:val="auto"/>
-                <w:sz w:val="24"/>
-                <w:lang w:val="es-CL"/>
-              </w:rPr>
-            </w:pPr>
-            <w:r>
-              <w:rPr>
-                <w:bCs/>
-                <w:color w:val="auto"/>
-                <w:sz w:val="24"/>
+            <w:tcW w:w="1250" w:type="dxa"/>
+          </w:tcPr>
+          <w:p>
+            <w:pPr>
+              <w:rPr>
+                <w:bCs/>
+                <w:color w:val="auto"/>
+                <w:sz w:val="18"/>
+                <w:szCs w:val="18"/>
+                <w:lang w:val="es-CL"/>
+              </w:rPr>
+            </w:pPr>
+            <w:r>
+              <w:rPr>
+                <w:bCs/>
+                <w:color w:val="auto"/>
+                <w:sz w:val="18"/>
+                <w:szCs w:val="18"/>
                 <w:lang w:val="es-CL"/>
               </w:rPr>
               <w:t>Brandon – Erick</w:t>
@@ -2392,22 +3019,24 @@
         </w:tc>
         <w:tc>
           <w:tcPr>
-            <w:tcW w:w="4851" w:type="dxa"/>
-          </w:tcPr>
-          <w:p>
-            <w:pPr>
-              <w:rPr>
-                <w:bCs/>
-                <w:color w:val="auto"/>
-                <w:sz w:val="24"/>
-                <w:lang w:val="es-CL"/>
-              </w:rPr>
-            </w:pPr>
-            <w:r>
-              <w:rPr>
-                <w:bCs/>
-                <w:color w:val="auto"/>
-                <w:sz w:val="24"/>
+            <w:tcW w:w="4406" w:type="dxa"/>
+          </w:tcPr>
+          <w:p>
+            <w:pPr>
+              <w:rPr>
+                <w:bCs/>
+                <w:color w:val="auto"/>
+                <w:sz w:val="18"/>
+                <w:szCs w:val="18"/>
+                <w:lang w:val="es-CL"/>
+              </w:rPr>
+            </w:pPr>
+            <w:r>
+              <w:rPr>
+                <w:bCs/>
+                <w:color w:val="auto"/>
+                <w:sz w:val="18"/>
+                <w:szCs w:val="18"/>
                 <w:lang w:val="es-CL"/>
               </w:rPr>
               <w:t>Apellido_Nombre_1.2_APT122_</w:t>
@@ -2416,40 +3045,61 @@
               <w:rPr>
                 <w:bCs/>
                 <w:color w:val="auto"/>
-                <w:sz w:val="24"/>
+                <w:sz w:val="18"/>
+                <w:szCs w:val="18"/>
                 <w:lang w:val="es-CL"/>
               </w:rPr>
               <w:br/>
-            </w:r>
-            <w:r>
-              <w:rPr>
-                <w:bCs/>
-                <w:color w:val="auto"/>
-                <w:sz w:val="24"/>
-                <w:lang w:val="es-CL"/>
-              </w:rPr>
               <w:t>DiarioReflexionFase1</w:t>
             </w:r>
           </w:p>
         </w:tc>
         <w:tc>
           <w:tcPr>
-            <w:tcW w:w="677" w:type="dxa"/>
-          </w:tcPr>
-          <w:p>
-            <w:pPr>
-              <w:rPr>
-                <w:bCs/>
-                <w:color w:val="auto"/>
-                <w:sz w:val="24"/>
-                <w:lang w:val="es-CL"/>
-              </w:rPr>
-            </w:pPr>
-            <w:r>
-              <w:rPr>
-                <w:bCs/>
-                <w:color w:val="auto"/>
-                <w:sz w:val="24"/>
+            <w:tcW w:w="1257" w:type="dxa"/>
+          </w:tcPr>
+          <w:p>
+            <w:pPr>
+              <w:rPr>
+                <w:bCs/>
+                <w:color w:val="auto"/>
+                <w:sz w:val="18"/>
+                <w:szCs w:val="18"/>
+                <w:lang w:val="es-CL"/>
+              </w:rPr>
+            </w:pPr>
+            <w:r>
+              <w:rPr>
+                <w:bCs/>
+                <w:color w:val="auto"/>
+                <w:sz w:val="18"/>
+                <w:szCs w:val="18"/>
+                <w:lang w:val="es-CL"/>
+              </w:rPr>
+              <w:t>Terminado</w:t>
+            </w:r>
+          </w:p>
+        </w:tc>
+        <w:tc>
+          <w:tcPr>
+            <w:tcW w:w="850" w:type="dxa"/>
+          </w:tcPr>
+          <w:p>
+            <w:pPr>
+              <w:rPr>
+                <w:bCs/>
+                <w:color w:val="auto"/>
+                <w:sz w:val="18"/>
+                <w:szCs w:val="18"/>
+                <w:lang w:val="es-CL"/>
+              </w:rPr>
+            </w:pPr>
+            <w:r>
+              <w:rPr>
+                <w:bCs/>
+                <w:color w:val="auto"/>
+                <w:sz w:val="18"/>
+                <w:szCs w:val="18"/>
                 <w:lang w:val="es-CL"/>
               </w:rPr>
               <w:t>2</w:t>
@@ -2460,22 +3110,24 @@
       <w:tr>
         <w:tc>
           <w:tcPr>
-            <w:tcW w:w="2333" w:type="dxa"/>
-          </w:tcPr>
-          <w:p>
-            <w:pPr>
-              <w:rPr>
-                <w:bCs/>
-                <w:color w:val="auto"/>
-                <w:sz w:val="24"/>
-                <w:lang w:val="es-CL"/>
-              </w:rPr>
-            </w:pPr>
-            <w:r>
-              <w:rPr>
-                <w:bCs/>
-                <w:color w:val="auto"/>
-                <w:sz w:val="24"/>
+            <w:tcW w:w="1446" w:type="dxa"/>
+          </w:tcPr>
+          <w:p>
+            <w:pPr>
+              <w:rPr>
+                <w:bCs/>
+                <w:color w:val="auto"/>
+                <w:sz w:val="18"/>
+                <w:szCs w:val="18"/>
+                <w:lang w:val="es-CL"/>
+              </w:rPr>
+            </w:pPr>
+            <w:r>
+              <w:rPr>
+                <w:bCs/>
+                <w:color w:val="auto"/>
+                <w:sz w:val="18"/>
+                <w:szCs w:val="18"/>
                 <w:lang w:val="es-CL"/>
               </w:rPr>
               <w:t>Desarrollar documento 1.3 (cada integrante)</w:t>
@@ -2484,22 +3136,24 @@
         </w:tc>
         <w:tc>
           <w:tcPr>
-            <w:tcW w:w="1348" w:type="dxa"/>
-          </w:tcPr>
-          <w:p>
-            <w:pPr>
-              <w:rPr>
-                <w:bCs/>
-                <w:color w:val="auto"/>
-                <w:sz w:val="24"/>
-                <w:lang w:val="es-CL"/>
-              </w:rPr>
-            </w:pPr>
-            <w:r>
-              <w:rPr>
-                <w:bCs/>
-                <w:color w:val="auto"/>
-                <w:sz w:val="24"/>
+            <w:tcW w:w="1250" w:type="dxa"/>
+          </w:tcPr>
+          <w:p>
+            <w:pPr>
+              <w:rPr>
+                <w:bCs/>
+                <w:color w:val="auto"/>
+                <w:sz w:val="18"/>
+                <w:szCs w:val="18"/>
+                <w:lang w:val="es-CL"/>
+              </w:rPr>
+            </w:pPr>
+            <w:r>
+              <w:rPr>
+                <w:bCs/>
+                <w:color w:val="auto"/>
+                <w:sz w:val="18"/>
+                <w:szCs w:val="18"/>
                 <w:lang w:val="es-CL"/>
               </w:rPr>
               <w:t>Brandon – Erick</w:t>
@@ -2508,22 +3162,24 @@
         </w:tc>
         <w:tc>
           <w:tcPr>
-            <w:tcW w:w="4851" w:type="dxa"/>
-          </w:tcPr>
-          <w:p>
-            <w:pPr>
-              <w:rPr>
-                <w:bCs/>
-                <w:color w:val="auto"/>
-                <w:sz w:val="24"/>
-                <w:lang w:val="es-CL"/>
-              </w:rPr>
-            </w:pPr>
-            <w:r>
-              <w:rPr>
-                <w:bCs/>
-                <w:color w:val="auto"/>
-                <w:sz w:val="24"/>
+            <w:tcW w:w="4406" w:type="dxa"/>
+          </w:tcPr>
+          <w:p>
+            <w:pPr>
+              <w:rPr>
+                <w:bCs/>
+                <w:color w:val="auto"/>
+                <w:sz w:val="18"/>
+                <w:szCs w:val="18"/>
+                <w:lang w:val="es-CL"/>
+              </w:rPr>
+            </w:pPr>
+            <w:r>
+              <w:rPr>
+                <w:bCs/>
+                <w:color w:val="auto"/>
+                <w:sz w:val="18"/>
+                <w:szCs w:val="18"/>
                 <w:lang w:val="es-CL"/>
               </w:rPr>
               <w:t>Apellido_Nombre_1.3_APT122_</w:t>
@@ -2532,40 +3188,61 @@
               <w:rPr>
                 <w:bCs/>
                 <w:color w:val="auto"/>
-                <w:sz w:val="24"/>
+                <w:sz w:val="18"/>
+                <w:szCs w:val="18"/>
                 <w:lang w:val="es-CL"/>
               </w:rPr>
               <w:br/>
-            </w:r>
-            <w:r>
-              <w:rPr>
-                <w:bCs/>
-                <w:color w:val="auto"/>
-                <w:sz w:val="24"/>
-                <w:lang w:val="es-CL"/>
-              </w:rPr>
               <w:t>AutoevaluacionFase1</w:t>
             </w:r>
           </w:p>
         </w:tc>
         <w:tc>
           <w:tcPr>
-            <w:tcW w:w="677" w:type="dxa"/>
-          </w:tcPr>
-          <w:p>
-            <w:pPr>
-              <w:rPr>
-                <w:bCs/>
-                <w:color w:val="auto"/>
-                <w:sz w:val="24"/>
-                <w:lang w:val="es-CL"/>
-              </w:rPr>
-            </w:pPr>
-            <w:r>
-              <w:rPr>
-                <w:bCs/>
-                <w:color w:val="auto"/>
-                <w:sz w:val="24"/>
+            <w:tcW w:w="1257" w:type="dxa"/>
+          </w:tcPr>
+          <w:p>
+            <w:pPr>
+              <w:rPr>
+                <w:bCs/>
+                <w:color w:val="auto"/>
+                <w:sz w:val="18"/>
+                <w:szCs w:val="18"/>
+                <w:lang w:val="es-CL"/>
+              </w:rPr>
+            </w:pPr>
+            <w:r>
+              <w:rPr>
+                <w:bCs/>
+                <w:color w:val="auto"/>
+                <w:sz w:val="18"/>
+                <w:szCs w:val="18"/>
+                <w:lang w:val="es-CL"/>
+              </w:rPr>
+              <w:t>Terminado</w:t>
+            </w:r>
+          </w:p>
+        </w:tc>
+        <w:tc>
+          <w:tcPr>
+            <w:tcW w:w="850" w:type="dxa"/>
+          </w:tcPr>
+          <w:p>
+            <w:pPr>
+              <w:rPr>
+                <w:bCs/>
+                <w:color w:val="auto"/>
+                <w:sz w:val="18"/>
+                <w:szCs w:val="18"/>
+                <w:lang w:val="es-CL"/>
+              </w:rPr>
+            </w:pPr>
+            <w:r>
+              <w:rPr>
+                <w:bCs/>
+                <w:color w:val="auto"/>
+                <w:sz w:val="18"/>
+                <w:szCs w:val="18"/>
                 <w:lang w:val="es-CL"/>
               </w:rPr>
               <w:t>2</w:t>
@@ -2579,22 +3256,24 @@
         </w:trPr>
         <w:tc>
           <w:tcPr>
-            <w:tcW w:w="2333" w:type="dxa"/>
-          </w:tcPr>
-          <w:p>
-            <w:pPr>
-              <w:rPr>
-                <w:bCs/>
-                <w:color w:val="auto"/>
-                <w:sz w:val="24"/>
-                <w:lang w:val="es-CL"/>
-              </w:rPr>
-            </w:pPr>
-            <w:r>
-              <w:rPr>
-                <w:bCs/>
-                <w:color w:val="auto"/>
-                <w:sz w:val="24"/>
+            <w:tcW w:w="1446" w:type="dxa"/>
+          </w:tcPr>
+          <w:p>
+            <w:pPr>
+              <w:rPr>
+                <w:bCs/>
+                <w:color w:val="auto"/>
+                <w:sz w:val="18"/>
+                <w:szCs w:val="18"/>
+                <w:lang w:val="es-CL"/>
+              </w:rPr>
+            </w:pPr>
+            <w:r>
+              <w:rPr>
+                <w:bCs/>
+                <w:color w:val="auto"/>
+                <w:sz w:val="18"/>
+                <w:szCs w:val="18"/>
                 <w:lang w:val="es-CL"/>
               </w:rPr>
               <w:t>Desarrollar documento 1.4</w:t>
@@ -2603,22 +3282,24 @@
         </w:tc>
         <w:tc>
           <w:tcPr>
-            <w:tcW w:w="1348" w:type="dxa"/>
-          </w:tcPr>
-          <w:p>
-            <w:pPr>
-              <w:rPr>
-                <w:bCs/>
-                <w:color w:val="auto"/>
-                <w:sz w:val="24"/>
-                <w:lang w:val="es-CL"/>
-              </w:rPr>
-            </w:pPr>
-            <w:r>
-              <w:rPr>
-                <w:bCs/>
-                <w:color w:val="auto"/>
-                <w:sz w:val="24"/>
+            <w:tcW w:w="1250" w:type="dxa"/>
+          </w:tcPr>
+          <w:p>
+            <w:pPr>
+              <w:rPr>
+                <w:bCs/>
+                <w:color w:val="auto"/>
+                <w:sz w:val="18"/>
+                <w:szCs w:val="18"/>
+                <w:lang w:val="es-CL"/>
+              </w:rPr>
+            </w:pPr>
+            <w:r>
+              <w:rPr>
+                <w:bCs/>
+                <w:color w:val="auto"/>
+                <w:sz w:val="18"/>
+                <w:szCs w:val="18"/>
                 <w:lang w:val="es-CL"/>
               </w:rPr>
               <w:t>Docente</w:t>
@@ -2627,22 +3308,24 @@
         </w:tc>
         <w:tc>
           <w:tcPr>
-            <w:tcW w:w="4851" w:type="dxa"/>
-          </w:tcPr>
-          <w:p>
-            <w:pPr>
-              <w:rPr>
-                <w:bCs/>
-                <w:color w:val="auto"/>
-                <w:sz w:val="24"/>
-                <w:lang w:val="es-CL"/>
-              </w:rPr>
-            </w:pPr>
-            <w:r>
-              <w:rPr>
-                <w:bCs/>
-                <w:color w:val="auto"/>
-                <w:sz w:val="24"/>
+            <w:tcW w:w="4406" w:type="dxa"/>
+          </w:tcPr>
+          <w:p>
+            <w:pPr>
+              <w:rPr>
+                <w:bCs/>
+                <w:color w:val="auto"/>
+                <w:sz w:val="18"/>
+                <w:szCs w:val="18"/>
+                <w:lang w:val="es-CL"/>
+              </w:rPr>
+            </w:pPr>
+            <w:r>
+              <w:rPr>
+                <w:bCs/>
+                <w:color w:val="auto"/>
+                <w:sz w:val="18"/>
+                <w:szCs w:val="18"/>
                 <w:lang w:val="es-CL"/>
               </w:rPr>
               <w:t>1.4_APT122_FormativaFase1</w:t>
@@ -2651,22 +3334,50 @@
         </w:tc>
         <w:tc>
           <w:tcPr>
-            <w:tcW w:w="677" w:type="dxa"/>
-          </w:tcPr>
-          <w:p>
-            <w:pPr>
-              <w:rPr>
-                <w:bCs/>
-                <w:color w:val="auto"/>
-                <w:sz w:val="24"/>
-                <w:lang w:val="es-CL"/>
-              </w:rPr>
-            </w:pPr>
-            <w:r>
-              <w:rPr>
-                <w:bCs/>
-                <w:color w:val="auto"/>
-                <w:sz w:val="24"/>
+            <w:tcW w:w="1257" w:type="dxa"/>
+          </w:tcPr>
+          <w:p>
+            <w:pPr>
+              <w:rPr>
+                <w:bCs/>
+                <w:color w:val="auto"/>
+                <w:sz w:val="18"/>
+                <w:szCs w:val="18"/>
+                <w:lang w:val="es-CL"/>
+              </w:rPr>
+            </w:pPr>
+            <w:r>
+              <w:rPr>
+                <w:bCs/>
+                <w:color w:val="auto"/>
+                <w:sz w:val="18"/>
+                <w:szCs w:val="18"/>
+                <w:lang w:val="es-CL"/>
+              </w:rPr>
+              <w:t>Pendiente Docente</w:t>
+            </w:r>
+          </w:p>
+        </w:tc>
+        <w:tc>
+          <w:tcPr>
+            <w:tcW w:w="850" w:type="dxa"/>
+          </w:tcPr>
+          <w:p>
+            <w:pPr>
+              <w:rPr>
+                <w:bCs/>
+                <w:color w:val="auto"/>
+                <w:sz w:val="18"/>
+                <w:szCs w:val="18"/>
+                <w:lang w:val="es-CL"/>
+              </w:rPr>
+            </w:pPr>
+            <w:r>
+              <w:rPr>
+                <w:bCs/>
+                <w:color w:val="auto"/>
+                <w:sz w:val="18"/>
+                <w:szCs w:val="18"/>
                 <w:lang w:val="es-CL"/>
               </w:rPr>
               <w:t>-</w:t>
@@ -2680,22 +3391,24 @@
         </w:trPr>
         <w:tc>
           <w:tcPr>
-            <w:tcW w:w="2333" w:type="dxa"/>
-          </w:tcPr>
-          <w:p>
-            <w:pPr>
-              <w:rPr>
-                <w:bCs/>
-                <w:color w:val="auto"/>
-                <w:sz w:val="24"/>
-                <w:lang w:val="es-CL"/>
-              </w:rPr>
-            </w:pPr>
-            <w:r>
-              <w:rPr>
-                <w:bCs/>
-                <w:color w:val="auto"/>
-                <w:sz w:val="24"/>
+            <w:tcW w:w="1446" w:type="dxa"/>
+          </w:tcPr>
+          <w:p>
+            <w:pPr>
+              <w:rPr>
+                <w:bCs/>
+                <w:color w:val="auto"/>
+                <w:sz w:val="18"/>
+                <w:szCs w:val="18"/>
+                <w:lang w:val="es-CL"/>
+              </w:rPr>
+            </w:pPr>
+            <w:r>
+              <w:rPr>
+                <w:bCs/>
+                <w:color w:val="auto"/>
+                <w:sz w:val="18"/>
+                <w:szCs w:val="18"/>
                 <w:lang w:val="es-CL"/>
               </w:rPr>
               <w:t>Desarrollar documento 1.5 (en conjunto)</w:t>
@@ -2704,22 +3417,24 @@
         </w:tc>
         <w:tc>
           <w:tcPr>
-            <w:tcW w:w="1348" w:type="dxa"/>
-          </w:tcPr>
-          <w:p>
-            <w:pPr>
-              <w:rPr>
-                <w:bCs/>
-                <w:color w:val="auto"/>
-                <w:sz w:val="24"/>
-                <w:lang w:val="es-CL"/>
-              </w:rPr>
-            </w:pPr>
-            <w:r>
-              <w:rPr>
-                <w:bCs/>
-                <w:color w:val="auto"/>
-                <w:sz w:val="24"/>
+            <w:tcW w:w="1250" w:type="dxa"/>
+          </w:tcPr>
+          <w:p>
+            <w:pPr>
+              <w:rPr>
+                <w:bCs/>
+                <w:color w:val="auto"/>
+                <w:sz w:val="18"/>
+                <w:szCs w:val="18"/>
+                <w:lang w:val="es-CL"/>
+              </w:rPr>
+            </w:pPr>
+            <w:r>
+              <w:rPr>
+                <w:bCs/>
+                <w:color w:val="auto"/>
+                <w:sz w:val="18"/>
+                <w:szCs w:val="18"/>
                 <w:lang w:val="es-CL"/>
               </w:rPr>
               <w:t>Brandon – Erick</w:t>
@@ -2728,22 +3443,24 @@
         </w:tc>
         <w:tc>
           <w:tcPr>
-            <w:tcW w:w="4851" w:type="dxa"/>
-          </w:tcPr>
-          <w:p>
-            <w:pPr>
-              <w:rPr>
-                <w:bCs/>
-                <w:color w:val="auto"/>
-                <w:sz w:val="24"/>
-                <w:lang w:val="es-CL"/>
-              </w:rPr>
-            </w:pPr>
-            <w:r>
-              <w:rPr>
-                <w:bCs/>
-                <w:color w:val="auto"/>
-                <w:sz w:val="24"/>
+            <w:tcW w:w="4406" w:type="dxa"/>
+          </w:tcPr>
+          <w:p>
+            <w:pPr>
+              <w:rPr>
+                <w:bCs/>
+                <w:color w:val="auto"/>
+                <w:sz w:val="18"/>
+                <w:szCs w:val="18"/>
+                <w:lang w:val="es-CL"/>
+              </w:rPr>
+            </w:pPr>
+            <w:r>
+              <w:rPr>
+                <w:bCs/>
+                <w:color w:val="auto"/>
+                <w:sz w:val="18"/>
+                <w:szCs w:val="18"/>
                 <w:lang w:val="es-CL"/>
               </w:rPr>
               <w:t>1.5_GuiaEstudiante_Fase 1_</w:t>
@@ -2752,40 +3469,61 @@
               <w:rPr>
                 <w:bCs/>
                 <w:color w:val="auto"/>
-                <w:sz w:val="24"/>
+                <w:sz w:val="18"/>
+                <w:szCs w:val="18"/>
                 <w:lang w:val="es-CL"/>
               </w:rPr>
               <w:br/>
-            </w:r>
-            <w:r>
-              <w:rPr>
-                <w:bCs/>
-                <w:color w:val="auto"/>
-                <w:sz w:val="24"/>
-                <w:lang w:val="es-CL"/>
-              </w:rPr>
               <w:t>Definicion Proyecto APT (Español)</w:t>
             </w:r>
           </w:p>
         </w:tc>
         <w:tc>
           <w:tcPr>
-            <w:tcW w:w="677" w:type="dxa"/>
-          </w:tcPr>
-          <w:p>
-            <w:pPr>
-              <w:rPr>
-                <w:bCs/>
-                <w:color w:val="auto"/>
-                <w:sz w:val="24"/>
-                <w:lang w:val="es-CL"/>
-              </w:rPr>
-            </w:pPr>
-            <w:r>
-              <w:rPr>
-                <w:bCs/>
-                <w:color w:val="auto"/>
-                <w:sz w:val="24"/>
+            <w:tcW w:w="1257" w:type="dxa"/>
+          </w:tcPr>
+          <w:p>
+            <w:pPr>
+              <w:rPr>
+                <w:bCs/>
+                <w:color w:val="auto"/>
+                <w:sz w:val="18"/>
+                <w:szCs w:val="18"/>
+                <w:lang w:val="es-CL"/>
+              </w:rPr>
+            </w:pPr>
+            <w:r>
+              <w:rPr>
+                <w:bCs/>
+                <w:color w:val="auto"/>
+                <w:sz w:val="18"/>
+                <w:szCs w:val="18"/>
+                <w:lang w:val="es-CL"/>
+              </w:rPr>
+              <w:t>Terminado</w:t>
+            </w:r>
+          </w:p>
+        </w:tc>
+        <w:tc>
+          <w:tcPr>
+            <w:tcW w:w="850" w:type="dxa"/>
+          </w:tcPr>
+          <w:p>
+            <w:pPr>
+              <w:rPr>
+                <w:bCs/>
+                <w:color w:val="auto"/>
+                <w:sz w:val="18"/>
+                <w:szCs w:val="18"/>
+                <w:lang w:val="es-CL"/>
+              </w:rPr>
+            </w:pPr>
+            <w:r>
+              <w:rPr>
+                <w:bCs/>
+                <w:color w:val="auto"/>
+                <w:sz w:val="18"/>
+                <w:szCs w:val="18"/>
                 <w:lang w:val="es-CL"/>
               </w:rPr>
               <w:t>5</w:t>
@@ -2799,22 +3537,24 @@
         </w:trPr>
         <w:tc>
           <w:tcPr>
-            <w:tcW w:w="2333" w:type="dxa"/>
-          </w:tcPr>
-          <w:p>
-            <w:pPr>
-              <w:rPr>
-                <w:bCs/>
-                <w:color w:val="auto"/>
-                <w:sz w:val="24"/>
-                <w:lang w:val="es-CL"/>
-              </w:rPr>
-            </w:pPr>
-            <w:r>
-              <w:rPr>
-                <w:bCs/>
-                <w:color w:val="auto"/>
-                <w:sz w:val="24"/>
+            <w:tcW w:w="1446" w:type="dxa"/>
+          </w:tcPr>
+          <w:p>
+            <w:pPr>
+              <w:rPr>
+                <w:bCs/>
+                <w:color w:val="auto"/>
+                <w:sz w:val="18"/>
+                <w:szCs w:val="18"/>
+                <w:lang w:val="es-CL"/>
+              </w:rPr>
+            </w:pPr>
+            <w:r>
+              <w:rPr>
+                <w:bCs/>
+                <w:color w:val="auto"/>
+                <w:sz w:val="18"/>
+                <w:szCs w:val="18"/>
                 <w:lang w:val="es-CL"/>
               </w:rPr>
               <w:t>Creación de repositorio</w:t>
@@ -2823,22 +3563,24 @@
         </w:tc>
         <w:tc>
           <w:tcPr>
-            <w:tcW w:w="1348" w:type="dxa"/>
-          </w:tcPr>
-          <w:p>
-            <w:pPr>
-              <w:rPr>
-                <w:bCs/>
-                <w:color w:val="auto"/>
-                <w:sz w:val="24"/>
-                <w:lang w:val="es-CL"/>
-              </w:rPr>
-            </w:pPr>
-            <w:r>
-              <w:rPr>
-                <w:bCs/>
-                <w:color w:val="auto"/>
-                <w:sz w:val="24"/>
+            <w:tcW w:w="1250" w:type="dxa"/>
+          </w:tcPr>
+          <w:p>
+            <w:pPr>
+              <w:rPr>
+                <w:bCs/>
+                <w:color w:val="auto"/>
+                <w:sz w:val="18"/>
+                <w:szCs w:val="18"/>
+                <w:lang w:val="es-CL"/>
+              </w:rPr>
+            </w:pPr>
+            <w:r>
+              <w:rPr>
+                <w:bCs/>
+                <w:color w:val="auto"/>
+                <w:sz w:val="18"/>
+                <w:szCs w:val="18"/>
                 <w:lang w:val="es-CL"/>
               </w:rPr>
               <w:t>Erick</w:t>
@@ -2847,22 +3589,24 @@
         </w:tc>
         <w:tc>
           <w:tcPr>
-            <w:tcW w:w="4851" w:type="dxa"/>
-          </w:tcPr>
-          <w:p>
-            <w:pPr>
-              <w:rPr>
-                <w:bCs/>
-                <w:color w:val="auto"/>
-                <w:sz w:val="24"/>
-                <w:lang w:val="es-CL"/>
-              </w:rPr>
-            </w:pPr>
-            <w:r>
-              <w:rPr>
-                <w:bCs/>
-                <w:color w:val="auto"/>
-                <w:sz w:val="24"/>
+            <w:tcW w:w="4406" w:type="dxa"/>
+          </w:tcPr>
+          <w:p>
+            <w:pPr>
+              <w:rPr>
+                <w:bCs/>
+                <w:color w:val="auto"/>
+                <w:sz w:val="18"/>
+                <w:szCs w:val="18"/>
+                <w:lang w:val="es-CL"/>
+              </w:rPr>
+            </w:pPr>
+            <w:r>
+              <w:rPr>
+                <w:bCs/>
+                <w:color w:val="auto"/>
+                <w:sz w:val="18"/>
+                <w:szCs w:val="18"/>
                 <w:lang w:val="es-CL"/>
               </w:rPr>
               <w:t>https://github.com/ErickDan12/SegurIA-LPR.git</w:t>
@@ -2871,22 +3615,50 @@
         </w:tc>
         <w:tc>
           <w:tcPr>
-            <w:tcW w:w="677" w:type="dxa"/>
-          </w:tcPr>
-          <w:p>
-            <w:pPr>
-              <w:rPr>
-                <w:bCs/>
-                <w:color w:val="auto"/>
-                <w:sz w:val="24"/>
-                <w:lang w:val="es-CL"/>
-              </w:rPr>
-            </w:pPr>
-            <w:r>
-              <w:rPr>
-                <w:bCs/>
-                <w:color w:val="auto"/>
-                <w:sz w:val="24"/>
+            <w:tcW w:w="1257" w:type="dxa"/>
+          </w:tcPr>
+          <w:p>
+            <w:pPr>
+              <w:rPr>
+                <w:bCs/>
+                <w:color w:val="auto"/>
+                <w:sz w:val="18"/>
+                <w:szCs w:val="18"/>
+                <w:lang w:val="es-CL"/>
+              </w:rPr>
+            </w:pPr>
+            <w:r>
+              <w:rPr>
+                <w:bCs/>
+                <w:color w:val="auto"/>
+                <w:sz w:val="18"/>
+                <w:szCs w:val="18"/>
+                <w:lang w:val="es-CL"/>
+              </w:rPr>
+              <w:t>Terminado</w:t>
+            </w:r>
+          </w:p>
+        </w:tc>
+        <w:tc>
+          <w:tcPr>
+            <w:tcW w:w="850" w:type="dxa"/>
+          </w:tcPr>
+          <w:p>
+            <w:pPr>
+              <w:rPr>
+                <w:bCs/>
+                <w:color w:val="auto"/>
+                <w:sz w:val="18"/>
+                <w:szCs w:val="18"/>
+                <w:lang w:val="es-CL"/>
+              </w:rPr>
+            </w:pPr>
+            <w:r>
+              <w:rPr>
+                <w:bCs/>
+                <w:color w:val="auto"/>
+                <w:sz w:val="18"/>
+                <w:szCs w:val="18"/>
                 <w:lang w:val="es-CL"/>
               </w:rPr>
               <w:t>1</w:t>
@@ -2900,22 +3672,24 @@
         </w:trPr>
         <w:tc>
           <w:tcPr>
-            <w:tcW w:w="2333" w:type="dxa"/>
-          </w:tcPr>
-          <w:p>
-            <w:pPr>
-              <w:rPr>
-                <w:bCs/>
-                <w:color w:val="auto"/>
-                <w:sz w:val="24"/>
-                <w:lang w:val="es-CL"/>
-              </w:rPr>
-            </w:pPr>
-            <w:r>
-              <w:rPr>
-                <w:bCs/>
-                <w:color w:val="auto"/>
-                <w:sz w:val="24"/>
+            <w:tcW w:w="1446" w:type="dxa"/>
+          </w:tcPr>
+          <w:p>
+            <w:pPr>
+              <w:rPr>
+                <w:bCs/>
+                <w:color w:val="auto"/>
+                <w:sz w:val="18"/>
+                <w:szCs w:val="18"/>
+                <w:lang w:val="es-CL"/>
+              </w:rPr>
+            </w:pPr>
+            <w:r>
+              <w:rPr>
+                <w:bCs/>
+                <w:color w:val="auto"/>
+                <w:sz w:val="18"/>
+                <w:szCs w:val="18"/>
                 <w:lang w:val="es-CL"/>
               </w:rPr>
               <w:t>Subida de documentos</w:t>
@@ -2924,22 +3698,24 @@
         </w:tc>
         <w:tc>
           <w:tcPr>
-            <w:tcW w:w="1348" w:type="dxa"/>
-          </w:tcPr>
-          <w:p>
-            <w:pPr>
-              <w:rPr>
-                <w:bCs/>
-                <w:color w:val="auto"/>
-                <w:sz w:val="24"/>
-                <w:lang w:val="es-CL"/>
-              </w:rPr>
-            </w:pPr>
-            <w:r>
-              <w:rPr>
-                <w:bCs/>
-                <w:color w:val="auto"/>
-                <w:sz w:val="24"/>
+            <w:tcW w:w="1250" w:type="dxa"/>
+          </w:tcPr>
+          <w:p>
+            <w:pPr>
+              <w:rPr>
+                <w:bCs/>
+                <w:color w:val="auto"/>
+                <w:sz w:val="18"/>
+                <w:szCs w:val="18"/>
+                <w:lang w:val="es-CL"/>
+              </w:rPr>
+            </w:pPr>
+            <w:r>
+              <w:rPr>
+                <w:bCs/>
+                <w:color w:val="auto"/>
+                <w:sz w:val="18"/>
+                <w:szCs w:val="18"/>
                 <w:lang w:val="es-CL"/>
               </w:rPr>
               <w:t>Erick</w:t>
@@ -2948,22 +3724,24 @@
         </w:tc>
         <w:tc>
           <w:tcPr>
-            <w:tcW w:w="4851" w:type="dxa"/>
-          </w:tcPr>
-          <w:p>
-            <w:pPr>
-              <w:rPr>
-                <w:bCs/>
-                <w:color w:val="auto"/>
-                <w:sz w:val="24"/>
-                <w:lang w:val="es-CL"/>
-              </w:rPr>
-            </w:pPr>
-            <w:r>
-              <w:rPr>
-                <w:bCs/>
-                <w:color w:val="auto"/>
-                <w:sz w:val="24"/>
+            <w:tcW w:w="4406" w:type="dxa"/>
+          </w:tcPr>
+          <w:p>
+            <w:pPr>
+              <w:rPr>
+                <w:bCs/>
+                <w:color w:val="auto"/>
+                <w:sz w:val="18"/>
+                <w:szCs w:val="18"/>
+                <w:lang w:val="es-CL"/>
+              </w:rPr>
+            </w:pPr>
+            <w:r>
+              <w:rPr>
+                <w:bCs/>
+                <w:color w:val="auto"/>
+                <w:sz w:val="18"/>
+                <w:szCs w:val="18"/>
                 <w:lang w:val="es-CL"/>
               </w:rPr>
               <w:t>https://github.com/ErickDan12/SegurIA-LPR.git</w:t>
@@ -2972,22 +3750,50 @@
         </w:tc>
         <w:tc>
           <w:tcPr>
-            <w:tcW w:w="677" w:type="dxa"/>
-          </w:tcPr>
-          <w:p>
-            <w:pPr>
-              <w:rPr>
-                <w:bCs/>
-                <w:color w:val="auto"/>
-                <w:sz w:val="24"/>
-                <w:lang w:val="es-CL"/>
-              </w:rPr>
-            </w:pPr>
-            <w:r>
-              <w:rPr>
-                <w:bCs/>
-                <w:color w:val="auto"/>
-                <w:sz w:val="24"/>
+            <w:tcW w:w="1257" w:type="dxa"/>
+          </w:tcPr>
+          <w:p>
+            <w:pPr>
+              <w:rPr>
+                <w:bCs/>
+                <w:color w:val="auto"/>
+                <w:sz w:val="18"/>
+                <w:szCs w:val="18"/>
+                <w:lang w:val="es-CL"/>
+              </w:rPr>
+            </w:pPr>
+            <w:r>
+              <w:rPr>
+                <w:bCs/>
+                <w:color w:val="auto"/>
+                <w:sz w:val="18"/>
+                <w:szCs w:val="18"/>
+                <w:lang w:val="es-CL"/>
+              </w:rPr>
+              <w:t>Terminado</w:t>
+            </w:r>
+          </w:p>
+        </w:tc>
+        <w:tc>
+          <w:tcPr>
+            <w:tcW w:w="850" w:type="dxa"/>
+          </w:tcPr>
+          <w:p>
+            <w:pPr>
+              <w:rPr>
+                <w:bCs/>
+                <w:color w:val="auto"/>
+                <w:sz w:val="18"/>
+                <w:szCs w:val="18"/>
+                <w:lang w:val="es-CL"/>
+              </w:rPr>
+            </w:pPr>
+            <w:r>
+              <w:rPr>
+                <w:bCs/>
+                <w:color w:val="auto"/>
+                <w:sz w:val="18"/>
+                <w:szCs w:val="18"/>
                 <w:lang w:val="es-CL"/>
               </w:rPr>
               <w:t>1</w:t>
@@ -3001,55 +3807,50 @@
         </w:trPr>
         <w:tc>
           <w:tcPr>
-            <w:tcW w:w="2333" w:type="dxa"/>
-          </w:tcPr>
-          <w:p>
-            <w:pPr>
-              <w:rPr>
-                <w:bCs/>
-                <w:color w:val="auto"/>
-                <w:sz w:val="24"/>
-                <w:lang w:val="es-CL"/>
-              </w:rPr>
-            </w:pPr>
-            <w:r>
-              <w:rPr>
-                <w:bCs/>
-                <w:color w:val="auto"/>
-                <w:sz w:val="24"/>
-                <w:lang w:val="es-CL"/>
-              </w:rPr>
-              <w:t xml:space="preserve">Creación de </w:t>
-            </w:r>
-            <w:r>
-              <w:rPr>
-                <w:bCs/>
-                <w:color w:val="auto"/>
-                <w:sz w:val="24"/>
-                <w:lang w:val="es-CL"/>
-              </w:rPr>
-              <w:t>MER</w:t>
-            </w:r>
-          </w:p>
-        </w:tc>
-        <w:tc>
-          <w:tcPr>
-            <w:tcW w:w="1348" w:type="dxa"/>
-          </w:tcPr>
-          <w:p>
-            <w:pPr>
-              <w:rPr>
-                <w:bCs/>
-                <w:color w:val="auto"/>
-                <w:sz w:val="24"/>
-                <w:lang w:val="es-CL"/>
-              </w:rPr>
-            </w:pPr>
-            <w:r>
-              <w:rPr>
-                <w:bCs/>
-                <w:color w:val="auto"/>
-                <w:sz w:val="24"/>
+            <w:tcW w:w="1446" w:type="dxa"/>
+          </w:tcPr>
+          <w:p>
+            <w:pPr>
+              <w:rPr>
+                <w:bCs/>
+                <w:color w:val="auto"/>
+                <w:sz w:val="18"/>
+                <w:szCs w:val="18"/>
+                <w:lang w:val="es-CL"/>
+              </w:rPr>
+            </w:pPr>
+            <w:r>
+              <w:rPr>
+                <w:bCs/>
+                <w:color w:val="auto"/>
+                <w:sz w:val="18"/>
+                <w:szCs w:val="18"/>
+                <w:lang w:val="es-CL"/>
+              </w:rPr>
+              <w:t>Creación de MER</w:t>
+            </w:r>
+          </w:p>
+        </w:tc>
+        <w:tc>
+          <w:tcPr>
+            <w:tcW w:w="1250" w:type="dxa"/>
+          </w:tcPr>
+          <w:p>
+            <w:pPr>
+              <w:rPr>
+                <w:bCs/>
+                <w:color w:val="auto"/>
+                <w:sz w:val="18"/>
+                <w:szCs w:val="18"/>
+                <w:lang w:val="es-CL"/>
+              </w:rPr>
+            </w:pPr>
+            <w:r>
+              <w:rPr>
+                <w:bCs/>
+                <w:color w:val="auto"/>
+                <w:sz w:val="18"/>
+                <w:szCs w:val="18"/>
                 <w:lang w:val="es-CL"/>
               </w:rPr>
               <w:t>Erick</w:t>
@@ -3058,46 +3859,76 @@
         </w:tc>
         <w:tc>
           <w:tcPr>
-            <w:tcW w:w="4851" w:type="dxa"/>
-          </w:tcPr>
-          <w:p>
-            <w:pPr>
-              <w:rPr>
-                <w:bCs/>
-                <w:color w:val="auto"/>
-                <w:sz w:val="24"/>
-                <w:lang w:val="es-CL"/>
-              </w:rPr>
-            </w:pPr>
-            <w:r>
-              <w:rPr>
-                <w:bCs/>
-                <w:color w:val="auto"/>
-                <w:sz w:val="24"/>
-                <w:lang w:val="es-CL"/>
-              </w:rPr>
-              <w:t>-</w:t>
-            </w:r>
-          </w:p>
-        </w:tc>
-        <w:tc>
-          <w:tcPr>
-            <w:tcW w:w="677" w:type="dxa"/>
-          </w:tcPr>
-          <w:p>
-            <w:pPr>
-              <w:rPr>
-                <w:bCs/>
-                <w:color w:val="auto"/>
-                <w:sz w:val="24"/>
-                <w:lang w:val="es-CL"/>
-              </w:rPr>
-            </w:pPr>
-            <w:r>
-              <w:rPr>
-                <w:bCs/>
-                <w:color w:val="auto"/>
-                <w:sz w:val="24"/>
+            <w:tcW w:w="4406" w:type="dxa"/>
+          </w:tcPr>
+          <w:p>
+            <w:pPr>
+              <w:rPr>
+                <w:bCs/>
+                <w:color w:val="auto"/>
+                <w:sz w:val="18"/>
+                <w:szCs w:val="18"/>
+                <w:lang w:val="es-CL"/>
+              </w:rPr>
+            </w:pPr>
+            <w:r>
+              <w:rPr>
+                <w:bCs/>
+                <w:color w:val="auto"/>
+                <w:sz w:val="18"/>
+                <w:szCs w:val="18"/>
+                <w:lang w:val="es-CL"/>
+              </w:rPr>
+              <w:t>https://github.com/ErickDan12/SegurIA-LPR/tree/main/Fase%202/Evidencias%20Proyecto</w:t>
+            </w:r>
+          </w:p>
+        </w:tc>
+        <w:tc>
+          <w:tcPr>
+            <w:tcW w:w="1257" w:type="dxa"/>
+          </w:tcPr>
+          <w:p>
+            <w:pPr>
+              <w:rPr>
+                <w:bCs/>
+                <w:color w:val="auto"/>
+                <w:sz w:val="18"/>
+                <w:szCs w:val="18"/>
+                <w:lang w:val="es-CL"/>
+              </w:rPr>
+            </w:pPr>
+            <w:r>
+              <w:rPr>
+                <w:bCs/>
+                <w:color w:val="auto"/>
+                <w:sz w:val="18"/>
+                <w:szCs w:val="18"/>
+                <w:lang w:val="es-CL"/>
+              </w:rPr>
+              <w:t>Terminado</w:t>
+            </w:r>
+          </w:p>
+        </w:tc>
+        <w:tc>
+          <w:tcPr>
+            <w:tcW w:w="850" w:type="dxa"/>
+          </w:tcPr>
+          <w:p>
+            <w:pPr>
+              <w:rPr>
+                <w:bCs/>
+                <w:color w:val="auto"/>
+                <w:sz w:val="18"/>
+                <w:szCs w:val="18"/>
+                <w:lang w:val="es-CL"/>
+              </w:rPr>
+            </w:pPr>
+            <w:r>
+              <w:rPr>
+                <w:bCs/>
+                <w:color w:val="auto"/>
+                <w:sz w:val="18"/>
+                <w:szCs w:val="18"/>
                 <w:lang w:val="es-CL"/>
               </w:rPr>
               <w:t>2</w:t>
@@ -3111,22 +3942,24 @@
         </w:trPr>
         <w:tc>
           <w:tcPr>
-            <w:tcW w:w="2333" w:type="dxa"/>
-          </w:tcPr>
-          <w:p>
-            <w:pPr>
-              <w:rPr>
-                <w:bCs/>
-                <w:color w:val="auto"/>
-                <w:sz w:val="24"/>
-                <w:lang w:val="es-CL"/>
-              </w:rPr>
-            </w:pPr>
-            <w:r>
-              <w:rPr>
-                <w:bCs/>
-                <w:color w:val="auto"/>
-                <w:sz w:val="24"/>
+            <w:tcW w:w="1446" w:type="dxa"/>
+          </w:tcPr>
+          <w:p>
+            <w:pPr>
+              <w:rPr>
+                <w:bCs/>
+                <w:color w:val="auto"/>
+                <w:sz w:val="18"/>
+                <w:szCs w:val="18"/>
+                <w:lang w:val="es-CL"/>
+              </w:rPr>
+            </w:pPr>
+            <w:r>
+              <w:rPr>
+                <w:bCs/>
+                <w:color w:val="auto"/>
+                <w:sz w:val="18"/>
+                <w:szCs w:val="18"/>
                 <w:lang w:val="es-CL"/>
               </w:rPr>
               <w:t>Creación de modelo 4+1</w:t>
@@ -3135,22 +3968,24 @@
         </w:tc>
         <w:tc>
           <w:tcPr>
-            <w:tcW w:w="1348" w:type="dxa"/>
-          </w:tcPr>
-          <w:p>
-            <w:pPr>
-              <w:rPr>
-                <w:bCs/>
-                <w:color w:val="auto"/>
-                <w:sz w:val="24"/>
-                <w:lang w:val="es-CL"/>
-              </w:rPr>
-            </w:pPr>
-            <w:r>
-              <w:rPr>
-                <w:bCs/>
-                <w:color w:val="auto"/>
-                <w:sz w:val="24"/>
+            <w:tcW w:w="1250" w:type="dxa"/>
+          </w:tcPr>
+          <w:p>
+            <w:pPr>
+              <w:rPr>
+                <w:bCs/>
+                <w:color w:val="auto"/>
+                <w:sz w:val="18"/>
+                <w:szCs w:val="18"/>
+                <w:lang w:val="es-CL"/>
+              </w:rPr>
+            </w:pPr>
+            <w:r>
+              <w:rPr>
+                <w:bCs/>
+                <w:color w:val="auto"/>
+                <w:sz w:val="18"/>
+                <w:szCs w:val="18"/>
                 <w:lang w:val="es-CL"/>
               </w:rPr>
               <w:t>Brandon</w:t>
@@ -3159,46 +3994,76 @@
         </w:tc>
         <w:tc>
           <w:tcPr>
-            <w:tcW w:w="4851" w:type="dxa"/>
-          </w:tcPr>
-          <w:p>
-            <w:pPr>
-              <w:rPr>
-                <w:bCs/>
-                <w:color w:val="auto"/>
-                <w:sz w:val="24"/>
-                <w:lang w:val="es-CL"/>
-              </w:rPr>
-            </w:pPr>
-            <w:r>
-              <w:rPr>
-                <w:bCs/>
-                <w:color w:val="auto"/>
-                <w:sz w:val="24"/>
-                <w:lang w:val="es-CL"/>
-              </w:rPr>
-              <w:t>-</w:t>
-            </w:r>
-          </w:p>
-        </w:tc>
-        <w:tc>
-          <w:tcPr>
-            <w:tcW w:w="677" w:type="dxa"/>
-          </w:tcPr>
-          <w:p>
-            <w:pPr>
-              <w:rPr>
-                <w:bCs/>
-                <w:color w:val="auto"/>
-                <w:sz w:val="24"/>
-                <w:lang w:val="es-CL"/>
-              </w:rPr>
-            </w:pPr>
-            <w:r>
-              <w:rPr>
-                <w:bCs/>
-                <w:color w:val="auto"/>
-                <w:sz w:val="24"/>
+            <w:tcW w:w="4406" w:type="dxa"/>
+          </w:tcPr>
+          <w:p>
+            <w:pPr>
+              <w:rPr>
+                <w:bCs/>
+                <w:color w:val="auto"/>
+                <w:sz w:val="18"/>
+                <w:szCs w:val="18"/>
+                <w:lang w:val="es-CL"/>
+              </w:rPr>
+            </w:pPr>
+            <w:r>
+              <w:rPr>
+                <w:bCs/>
+                <w:color w:val="auto"/>
+                <w:sz w:val="18"/>
+                <w:szCs w:val="18"/>
+                <w:lang w:val="es-CL"/>
+              </w:rPr>
+              <w:t>https://github.com/ErickDan12/SegurIA-LPR/tree/main/Fase%202/Evidencias%20Proyecto</w:t>
+            </w:r>
+          </w:p>
+        </w:tc>
+        <w:tc>
+          <w:tcPr>
+            <w:tcW w:w="1257" w:type="dxa"/>
+          </w:tcPr>
+          <w:p>
+            <w:pPr>
+              <w:rPr>
+                <w:bCs/>
+                <w:color w:val="auto"/>
+                <w:sz w:val="18"/>
+                <w:szCs w:val="18"/>
+                <w:lang w:val="es-CL"/>
+              </w:rPr>
+            </w:pPr>
+            <w:r>
+              <w:rPr>
+                <w:bCs/>
+                <w:color w:val="auto"/>
+                <w:sz w:val="18"/>
+                <w:szCs w:val="18"/>
+                <w:lang w:val="es-CL"/>
+              </w:rPr>
+              <w:t>Terminado</w:t>
+            </w:r>
+          </w:p>
+        </w:tc>
+        <w:tc>
+          <w:tcPr>
+            <w:tcW w:w="850" w:type="dxa"/>
+          </w:tcPr>
+          <w:p>
+            <w:pPr>
+              <w:rPr>
+                <w:bCs/>
+                <w:color w:val="auto"/>
+                <w:sz w:val="18"/>
+                <w:szCs w:val="18"/>
+                <w:lang w:val="es-CL"/>
+              </w:rPr>
+            </w:pPr>
+            <w:r>
+              <w:rPr>
+                <w:bCs/>
+                <w:color w:val="auto"/>
+                <w:sz w:val="18"/>
+                <w:szCs w:val="18"/>
                 <w:lang w:val="es-CL"/>
               </w:rPr>
               <w:t>3</w:t>
@@ -3212,55 +4077,50 @@
         </w:trPr>
         <w:tc>
           <w:tcPr>
-            <w:tcW w:w="2333" w:type="dxa"/>
-          </w:tcPr>
-          <w:p>
-            <w:pPr>
-              <w:rPr>
-                <w:bCs/>
-                <w:color w:val="auto"/>
-                <w:sz w:val="24"/>
-                <w:lang w:val="es-CL"/>
-              </w:rPr>
-            </w:pPr>
-            <w:r>
-              <w:rPr>
-                <w:bCs/>
-                <w:color w:val="auto"/>
-                <w:sz w:val="24"/>
-                <w:lang w:val="es-CL"/>
-              </w:rPr>
-              <w:t>Creación de sistema web de vigilancia</w:t>
-            </w:r>
-            <w:r>
-              <w:rPr>
-                <w:bCs/>
-                <w:color w:val="auto"/>
-                <w:sz w:val="24"/>
-                <w:lang w:val="es-CL"/>
-              </w:rPr>
-              <w:t xml:space="preserve"> (Mockup)</w:t>
-            </w:r>
-          </w:p>
-        </w:tc>
-        <w:tc>
-          <w:tcPr>
-            <w:tcW w:w="1348" w:type="dxa"/>
-          </w:tcPr>
-          <w:p>
-            <w:pPr>
-              <w:rPr>
-                <w:bCs/>
-                <w:color w:val="auto"/>
-                <w:sz w:val="24"/>
-                <w:lang w:val="es-CL"/>
-              </w:rPr>
-            </w:pPr>
-            <w:r>
-              <w:rPr>
-                <w:bCs/>
-                <w:color w:val="auto"/>
-                <w:sz w:val="24"/>
+            <w:tcW w:w="1446" w:type="dxa"/>
+          </w:tcPr>
+          <w:p>
+            <w:pPr>
+              <w:rPr>
+                <w:bCs/>
+                <w:color w:val="auto"/>
+                <w:sz w:val="18"/>
+                <w:szCs w:val="18"/>
+                <w:lang w:val="es-CL"/>
+              </w:rPr>
+            </w:pPr>
+            <w:r>
+              <w:rPr>
+                <w:bCs/>
+                <w:color w:val="auto"/>
+                <w:sz w:val="18"/>
+                <w:szCs w:val="18"/>
+                <w:lang w:val="es-CL"/>
+              </w:rPr>
+              <w:t>Creación de sistema web de vigilancia (Mockup)</w:t>
+            </w:r>
+          </w:p>
+        </w:tc>
+        <w:tc>
+          <w:tcPr>
+            <w:tcW w:w="1250" w:type="dxa"/>
+          </w:tcPr>
+          <w:p>
+            <w:pPr>
+              <w:rPr>
+                <w:bCs/>
+                <w:color w:val="auto"/>
+                <w:sz w:val="18"/>
+                <w:szCs w:val="18"/>
+                <w:lang w:val="es-CL"/>
+              </w:rPr>
+            </w:pPr>
+            <w:r>
+              <w:rPr>
+                <w:bCs/>
+                <w:color w:val="auto"/>
+                <w:sz w:val="18"/>
+                <w:szCs w:val="18"/>
                 <w:lang w:val="es-CL"/>
               </w:rPr>
               <w:t>Brandon</w:t>
@@ -3269,46 +4129,76 @@
         </w:tc>
         <w:tc>
           <w:tcPr>
-            <w:tcW w:w="4851" w:type="dxa"/>
-          </w:tcPr>
-          <w:p>
-            <w:pPr>
-              <w:rPr>
-                <w:bCs/>
-                <w:color w:val="auto"/>
-                <w:sz w:val="24"/>
-                <w:lang w:val="es-CL"/>
-              </w:rPr>
-            </w:pPr>
-            <w:r>
-              <w:rPr>
-                <w:bCs/>
-                <w:color w:val="auto"/>
-                <w:sz w:val="24"/>
-                <w:lang w:val="es-CL"/>
-              </w:rPr>
-              <w:t>-</w:t>
-            </w:r>
-          </w:p>
-        </w:tc>
-        <w:tc>
-          <w:tcPr>
-            <w:tcW w:w="677" w:type="dxa"/>
-          </w:tcPr>
-          <w:p>
-            <w:pPr>
-              <w:rPr>
-                <w:bCs/>
-                <w:color w:val="auto"/>
-                <w:sz w:val="24"/>
-                <w:lang w:val="es-CL"/>
-              </w:rPr>
-            </w:pPr>
-            <w:r>
-              <w:rPr>
-                <w:bCs/>
-                <w:color w:val="auto"/>
-                <w:sz w:val="24"/>
+            <w:tcW w:w="4406" w:type="dxa"/>
+          </w:tcPr>
+          <w:p>
+            <w:pPr>
+              <w:rPr>
+                <w:bCs/>
+                <w:color w:val="auto"/>
+                <w:sz w:val="18"/>
+                <w:szCs w:val="18"/>
+                <w:lang w:val="es-CL"/>
+              </w:rPr>
+            </w:pPr>
+            <w:r>
+              <w:rPr>
+                <w:bCs/>
+                <w:color w:val="auto"/>
+                <w:sz w:val="18"/>
+                <w:szCs w:val="18"/>
+                <w:lang w:val="es-CL"/>
+              </w:rPr>
+              <w:t>https://github.com/ErickDan12/SegurIA-LPR/tree/main/Fase%202/Evidencias%20Proyecto</w:t>
+            </w:r>
+          </w:p>
+        </w:tc>
+        <w:tc>
+          <w:tcPr>
+            <w:tcW w:w="1257" w:type="dxa"/>
+          </w:tcPr>
+          <w:p>
+            <w:pPr>
+              <w:rPr>
+                <w:bCs/>
+                <w:color w:val="auto"/>
+                <w:sz w:val="18"/>
+                <w:szCs w:val="18"/>
+                <w:lang w:val="es-CL"/>
+              </w:rPr>
+            </w:pPr>
+            <w:r>
+              <w:rPr>
+                <w:bCs/>
+                <w:color w:val="auto"/>
+                <w:sz w:val="18"/>
+                <w:szCs w:val="18"/>
+                <w:lang w:val="es-CL"/>
+              </w:rPr>
+              <w:t>Pendiente Desarrollo</w:t>
+            </w:r>
+          </w:p>
+        </w:tc>
+        <w:tc>
+          <w:tcPr>
+            <w:tcW w:w="850" w:type="dxa"/>
+          </w:tcPr>
+          <w:p>
+            <w:pPr>
+              <w:rPr>
+                <w:bCs/>
+                <w:color w:val="auto"/>
+                <w:sz w:val="18"/>
+                <w:szCs w:val="18"/>
+                <w:lang w:val="es-CL"/>
+              </w:rPr>
+            </w:pPr>
+            <w:r>
+              <w:rPr>
+                <w:bCs/>
+                <w:color w:val="auto"/>
+                <w:sz w:val="18"/>
+                <w:szCs w:val="18"/>
                 <w:lang w:val="es-CL"/>
               </w:rPr>
               <w:t>6</w:t>
@@ -3322,22 +4212,24 @@
         </w:trPr>
         <w:tc>
           <w:tcPr>
-            <w:tcW w:w="2333" w:type="dxa"/>
-          </w:tcPr>
-          <w:p>
-            <w:pPr>
-              <w:rPr>
-                <w:bCs/>
-                <w:color w:val="auto"/>
-                <w:sz w:val="24"/>
-                <w:lang w:val="es-CL"/>
-              </w:rPr>
-            </w:pPr>
-            <w:r>
-              <w:rPr>
-                <w:bCs/>
-                <w:color w:val="auto"/>
-                <w:sz w:val="24"/>
+            <w:tcW w:w="1446" w:type="dxa"/>
+          </w:tcPr>
+          <w:p>
+            <w:pPr>
+              <w:rPr>
+                <w:bCs/>
+                <w:color w:val="auto"/>
+                <w:sz w:val="18"/>
+                <w:szCs w:val="18"/>
+                <w:lang w:val="es-CL"/>
+              </w:rPr>
+            </w:pPr>
+            <w:r>
+              <w:rPr>
+                <w:bCs/>
+                <w:color w:val="auto"/>
+                <w:sz w:val="18"/>
+                <w:szCs w:val="18"/>
                 <w:lang w:val="es-CL"/>
               </w:rPr>
               <w:t>Creación de documento de seguimiento diario</w:t>
@@ -3346,22 +4238,24 @@
         </w:tc>
         <w:tc>
           <w:tcPr>
-            <w:tcW w:w="1348" w:type="dxa"/>
-          </w:tcPr>
-          <w:p>
-            <w:pPr>
-              <w:rPr>
-                <w:bCs/>
-                <w:color w:val="auto"/>
-                <w:sz w:val="24"/>
-                <w:lang w:val="es-CL"/>
-              </w:rPr>
-            </w:pPr>
-            <w:r>
-              <w:rPr>
-                <w:bCs/>
-                <w:color w:val="auto"/>
-                <w:sz w:val="24"/>
+            <w:tcW w:w="1250" w:type="dxa"/>
+          </w:tcPr>
+          <w:p>
+            <w:pPr>
+              <w:rPr>
+                <w:bCs/>
+                <w:color w:val="auto"/>
+                <w:sz w:val="18"/>
+                <w:szCs w:val="18"/>
+                <w:lang w:val="es-CL"/>
+              </w:rPr>
+            </w:pPr>
+            <w:r>
+              <w:rPr>
+                <w:bCs/>
+                <w:color w:val="auto"/>
+                <w:sz w:val="18"/>
+                <w:szCs w:val="18"/>
                 <w:lang w:val="es-CL"/>
               </w:rPr>
               <w:t>Brandon</w:t>
@@ -3370,37 +4264,76 @@
         </w:tc>
         <w:tc>
           <w:tcPr>
-            <w:tcW w:w="4851" w:type="dxa"/>
-          </w:tcPr>
-          <w:p>
-            <w:pPr>
-              <w:rPr>
-                <w:bCs/>
-                <w:color w:val="auto"/>
-                <w:sz w:val="24"/>
-                <w:lang w:val="es-CL"/>
-              </w:rPr>
-            </w:pPr>
-          </w:p>
-        </w:tc>
-        <w:tc>
-          <w:tcPr>
-            <w:tcW w:w="677" w:type="dxa"/>
-          </w:tcPr>
-          <w:p>
-            <w:pPr>
-              <w:rPr>
-                <w:bCs/>
-                <w:color w:val="auto"/>
-                <w:sz w:val="24"/>
-                <w:lang w:val="es-CL"/>
-              </w:rPr>
-            </w:pPr>
-            <w:r>
-              <w:rPr>
-                <w:bCs/>
-                <w:color w:val="auto"/>
-                <w:sz w:val="24"/>
+            <w:tcW w:w="4406" w:type="dxa"/>
+          </w:tcPr>
+          <w:p>
+            <w:pPr>
+              <w:rPr>
+                <w:bCs/>
+                <w:color w:val="auto"/>
+                <w:sz w:val="18"/>
+                <w:szCs w:val="18"/>
+                <w:lang w:val="es-CL"/>
+              </w:rPr>
+            </w:pPr>
+            <w:r>
+              <w:rPr>
+                <w:bCs/>
+                <w:color w:val="auto"/>
+                <w:sz w:val="18"/>
+                <w:szCs w:val="18"/>
+                <w:lang w:val="es-CL"/>
+              </w:rPr>
+              <w:t>https://github.com/ErickDan12/SegurIA-LPR/tree/main/Fase%202/Evidencias%20Proyecto</w:t>
+            </w:r>
+          </w:p>
+        </w:tc>
+        <w:tc>
+          <w:tcPr>
+            <w:tcW w:w="1257" w:type="dxa"/>
+          </w:tcPr>
+          <w:p>
+            <w:pPr>
+              <w:rPr>
+                <w:bCs/>
+                <w:color w:val="auto"/>
+                <w:sz w:val="18"/>
+                <w:szCs w:val="18"/>
+                <w:lang w:val="es-CL"/>
+              </w:rPr>
+            </w:pPr>
+            <w:r>
+              <w:rPr>
+                <w:bCs/>
+                <w:color w:val="auto"/>
+                <w:sz w:val="18"/>
+                <w:szCs w:val="18"/>
+                <w:lang w:val="es-CL"/>
+              </w:rPr>
+              <w:t>Terminado</w:t>
+            </w:r>
+          </w:p>
+        </w:tc>
+        <w:tc>
+          <w:tcPr>
+            <w:tcW w:w="850" w:type="dxa"/>
+          </w:tcPr>
+          <w:p>
+            <w:pPr>
+              <w:rPr>
+                <w:bCs/>
+                <w:color w:val="auto"/>
+                <w:sz w:val="18"/>
+                <w:szCs w:val="18"/>
+                <w:lang w:val="es-CL"/>
+              </w:rPr>
+            </w:pPr>
+            <w:r>
+              <w:rPr>
+                <w:bCs/>
+                <w:color w:val="auto"/>
+                <w:sz w:val="18"/>
+                <w:szCs w:val="18"/>
                 <w:lang w:val="es-CL"/>
               </w:rPr>
               <w:t>2</w:t>
@@ -3603,12 +4536,22 @@
             <w:rPr>
               <w:rFonts w:asciiTheme="minorHAnsi" w:hAnsiTheme="minorHAnsi" w:cstheme="minorHAnsi"/>
               <w:bCs/>
+              <w:color w:val="auto"/>
+              <w:sz w:val="18"/>
+              <w:szCs w:val="18"/>
+            </w:rPr>
+            <w:t>24</w:t>
+          </w:r>
+          <w:r>
+            <w:rPr>
+              <w:rFonts w:asciiTheme="minorHAnsi" w:hAnsiTheme="minorHAnsi" w:cstheme="minorHAnsi"/>
+              <w:bCs/>
               <w:noProof/>
               <w:color w:val="auto"/>
               <w:sz w:val="18"/>
               <w:szCs w:val="18"/>
             </w:rPr>
-            <w:t>18/09/2026</w:t>
+            <w:t>/09/2026</w:t>
           </w:r>
           <w:r>
             <w:rPr>
@@ -9434,6 +10377,18 @@
       </w:tcPr>
     </w:tblStylePr>
   </w:style>
+  <w:style w:type="character" w:styleId="Mencinsinresolver">
+    <w:name w:val="Unresolved Mention"/>
+    <w:basedOn w:val="Fuentedeprrafopredeter"/>
+    <w:uiPriority w:val="99"/>
+    <w:semiHidden/>
+    <w:unhideWhenUsed/>
+    <w:rsid w:val="001C5CF4"/>
+    <w:rPr>
+      <w:color w:val="605E5C"/>
+      <w:shd w:val="clear" w:color="auto" w:fill="E1DFDD"/>
+    </w:rPr>
+  </w:style>
 </w:styles>
 </file>
 
@@ -9757,14 +10712,14 @@
 
 <file path=customXml/item1.xml><?xml version="1.0" encoding="utf-8"?>
 <?mso-contentType ?>
-<SharedContentType xmlns="Microsoft.SharePoint.Taxonomy.ContentTypeSync" SourceId="062cc390-04a6-4d8c-9cb6-e80f31cc7f16" ContentTypeId="0x010100FDB0D57B28D5C44AB7FFF390969D90A6" PreviousValue="false"/>
+<FormTemplates xmlns="http://schemas.microsoft.com/sharepoint/v3/contenttype/forms">
+  <Display>DocumentLibraryForm</Display>
+  <Edit>DocumentLibraryForm</Edit>
+  <New>DocumentLibraryForm</New>
+</FormTemplates>
 </file>
 
 <file path=customXml/item2.xml><?xml version="1.0" encoding="utf-8"?>
-<b:Sources xmlns:b="http://schemas.openxmlformats.org/officeDocument/2006/bibliography" xmlns="http://schemas.openxmlformats.org/officeDocument/2006/bibliography" SelectedStyle="\APA.XSL" StyleName="APA"/>
-</file>
-
-<file path=customXml/item3.xml><?xml version="1.0" encoding="utf-8"?>
 <p:properties xmlns:p="http://schemas.microsoft.com/office/2006/metadata/properties" xmlns:xsi="http://www.w3.org/2001/XMLSchema-instance" xmlns:pc="http://schemas.microsoft.com/office/infopath/2007/PartnerControls">
   <documentManagement>
     <p18f15e5134d436c9ca69a256b6e730e xmlns="28339aae-3fff-441f-9d24-b99140d72712">
@@ -9849,13 +10804,13 @@
 </p:properties>
 </file>
 
+<file path=customXml/item3.xml><?xml version="1.0" encoding="utf-8"?>
+<b:Sources xmlns:b="http://schemas.openxmlformats.org/officeDocument/2006/bibliography" xmlns="http://schemas.openxmlformats.org/officeDocument/2006/bibliography" SelectedStyle="\APA.XSL" StyleName="APA"/>
+</file>
+
 <file path=customXml/item4.xml><?xml version="1.0" encoding="utf-8"?>
 <?mso-contentType ?>
-<FormTemplates xmlns="http://schemas.microsoft.com/sharepoint/v3/contenttype/forms">
-  <Display>DocumentLibraryForm</Display>
-  <Edit>DocumentLibraryForm</Edit>
-  <New>DocumentLibraryForm</New>
-</FormTemplates>
+<SharedContentType xmlns="Microsoft.SharePoint.Taxonomy.ContentTypeSync" SourceId="062cc390-04a6-4d8c-9cb6-e80f31cc7f16" ContentTypeId="0x010100FDB0D57B28D5C44AB7FFF390969D90A6" PreviousValue="false"/>
 </file>
 
 <file path=customXml/item5.xml><?xml version="1.0" encoding="utf-8"?>
@@ -10115,22 +11070,14 @@
 </file>
 
 <file path=customXml/itemProps1.xml><?xml version="1.0" encoding="utf-8"?>
-<ds:datastoreItem xmlns:ds="http://schemas.openxmlformats.org/officeDocument/2006/customXml" ds:itemID="{C5A87BC0-DCDA-46C7-B1BE-108BC38B3C2A}">
+<ds:datastoreItem xmlns:ds="http://schemas.openxmlformats.org/officeDocument/2006/customXml" ds:itemID="{FD5E228C-1CA6-4672-9711-E2A07AEAD3F7}">
   <ds:schemaRefs>
-    <ds:schemaRef ds:uri="Microsoft.SharePoint.Taxonomy.ContentTypeSync"/>
+    <ds:schemaRef ds:uri="http://schemas.microsoft.com/sharepoint/v3/contenttype/forms"/>
   </ds:schemaRefs>
 </ds:datastoreItem>
 </file>
 
 <file path=customXml/itemProps2.xml><?xml version="1.0" encoding="utf-8"?>
-<ds:datastoreItem xmlns:ds="http://schemas.openxmlformats.org/officeDocument/2006/customXml" ds:itemID="{55B2671B-C627-E849-9A74-93B7CD3D33A1}">
-  <ds:schemaRefs>
-    <ds:schemaRef ds:uri="http://schemas.openxmlformats.org/officeDocument/2006/bibliography"/>
-  </ds:schemaRefs>
-</ds:datastoreItem>
-</file>
-
-<file path=customXml/itemProps3.xml><?xml version="1.0" encoding="utf-8"?>
 <ds:datastoreItem xmlns:ds="http://schemas.openxmlformats.org/officeDocument/2006/customXml" ds:itemID="{1E9DF2DA-F881-4404-B211-CBAE2E709D04}">
   <ds:schemaRefs>
     <ds:schemaRef ds:uri="http://schemas.microsoft.com/office/2006/metadata/properties"/>
@@ -10140,10 +11087,18 @@
 </ds:datastoreItem>
 </file>
 
+<file path=customXml/itemProps3.xml><?xml version="1.0" encoding="utf-8"?>
+<ds:datastoreItem xmlns:ds="http://schemas.openxmlformats.org/officeDocument/2006/customXml" ds:itemID="{55B2671B-C627-E849-9A74-93B7CD3D33A1}">
+  <ds:schemaRefs>
+    <ds:schemaRef ds:uri="http://schemas.openxmlformats.org/officeDocument/2006/bibliography"/>
+  </ds:schemaRefs>
+</ds:datastoreItem>
+</file>
+
 <file path=customXml/itemProps4.xml><?xml version="1.0" encoding="utf-8"?>
-<ds:datastoreItem xmlns:ds="http://schemas.openxmlformats.org/officeDocument/2006/customXml" ds:itemID="{FD5E228C-1CA6-4672-9711-E2A07AEAD3F7}">
+<ds:datastoreItem xmlns:ds="http://schemas.openxmlformats.org/officeDocument/2006/customXml" ds:itemID="{C5A87BC0-DCDA-46C7-B1BE-108BC38B3C2A}">
   <ds:schemaRefs>
-    <ds:schemaRef ds:uri="http://schemas.microsoft.com/sharepoint/v3/contenttype/forms"/>
+    <ds:schemaRef ds:uri="Microsoft.SharePoint.Taxonomy.ContentTypeSync"/>
   </ds:schemaRefs>
 </ds:datastoreItem>
 </file>

</xml_diff>